<commit_message>
suggestions et modifs Isa sur Rapport2015 - bis
git-svn-id: http://svn.geogr.uni-jena.de/svn/jamsmodels/trunk@1738 503a54e1-1403-0410-a754-803ee147b016
</commit_message>
<xml_diff>
--- a/J2K_Irstea/Rapport2015.docx
+++ b/J2K_Irstea/Rapport2015.docx
@@ -1503,7 +1503,14 @@
             <w:rStyle w:val="Lienhypertexte"/>
             <w:noProof/>
           </w:rPr>
-          <w:t>Introduction (IG, ES ?)</w:t>
+          <w:t>Introduction (ES</w:t>
+        </w:r>
+        <w:r>
+          <w:rPr>
+            <w:rStyle w:val="Lienhypertexte"/>
+            <w:noProof/>
+          </w:rPr>
+          <w:t>)</w:t>
         </w:r>
         <w:r>
           <w:rPr>
@@ -3958,13 +3965,7 @@
       <w:bookmarkEnd w:id="67"/>
       <w:bookmarkEnd w:id="68"/>
       <w:r>
-        <w:t xml:space="preserve"> (</w:t>
-      </w:r>
-      <w:r>
-        <w:t xml:space="preserve">IG, </w:t>
-      </w:r>
-      <w:r>
-        <w:t>ES ?)</w:t>
+        <w:t xml:space="preserve"> (ES)</w:t>
       </w:r>
       <w:bookmarkEnd w:id="69"/>
     </w:p>
@@ -4074,7 +4075,13 @@
         <w:t>Amélioration de la modélisation en hydrologie naturelle</w:t>
       </w:r>
       <w:r>
-        <w:t xml:space="preserve"> (FT, IG)</w:t>
+        <w:t xml:space="preserve"> (FT, IG</w:t>
+      </w:r>
+      <w:r>
+        <w:t>, FB</w:t>
+      </w:r>
+      <w:r>
+        <w:t>)</w:t>
       </w:r>
       <w:bookmarkEnd w:id="76"/>
     </w:p>
@@ -8365,14 +8372,27 @@
       <w:r>
         <w:t xml:space="preserve">Tableau </w:t>
       </w:r>
-      <w:fldSimple w:instr=" SEQ Tableau \* ARABIC ">
-        <w:r>
-          <w:rPr>
-            <w:noProof/>
-          </w:rPr>
-          <w:t>17</w:t>
-        </w:r>
-      </w:fldSimple>
+      <w:r>
+        <w:fldChar w:fldCharType="begin"/>
+      </w:r>
+      <w:r>
+        <w:instrText xml:space="preserve"> SEQ Tableau \* ARABIC </w:instrText>
+      </w:r>
+      <w:r>
+        <w:fldChar w:fldCharType="separate"/>
+      </w:r>
+      <w:r>
+        <w:rPr>
+          <w:noProof/>
+        </w:rPr>
+        <w:t>17</w:t>
+      </w:r>
+      <w:r>
+        <w:rPr>
+          <w:noProof/>
+        </w:rPr>
+        <w:fldChar w:fldCharType="end"/>
+      </w:r>
       <w:bookmarkEnd w:id="88"/>
       <w:r>
         <w:t> : Caractéristiques des</w:t>
@@ -8462,14 +8482,27 @@
       <w:r>
         <w:t xml:space="preserve">Figure </w:t>
       </w:r>
-      <w:fldSimple w:instr=" SEQ Figure \* ARABIC ">
-        <w:r>
-          <w:rPr>
-            <w:noProof/>
-          </w:rPr>
-          <w:t>43</w:t>
-        </w:r>
-      </w:fldSimple>
+      <w:r>
+        <w:fldChar w:fldCharType="begin"/>
+      </w:r>
+      <w:r>
+        <w:instrText xml:space="preserve"> SEQ Figure \* ARABIC </w:instrText>
+      </w:r>
+      <w:r>
+        <w:fldChar w:fldCharType="separate"/>
+      </w:r>
+      <w:r>
+        <w:rPr>
+          <w:noProof/>
+        </w:rPr>
+        <w:t>43</w:t>
+      </w:r>
+      <w:r>
+        <w:rPr>
+          <w:noProof/>
+        </w:rPr>
+        <w:fldChar w:fldCharType="end"/>
+      </w:r>
       <w:bookmarkEnd w:id="89"/>
       <w:r>
         <w:t> : Présentation des principaux ouvrages hydrauliques présents sur le bassin du Rhône, ayant un effet notable sur le régime hydrologique</w:t>
@@ -9079,14 +9112,30 @@
       <w:r>
         <w:t xml:space="preserve">Figure </w:t>
       </w:r>
-      <w:fldSimple w:instr=" SEQ Figure \* ARABIC ">
-        <w:r>
-          <w:rPr>
-            <w:noProof/>
-          </w:rPr>
-          <w:t>1</w:t>
-        </w:r>
-      </w:fldSimple>
+      <w:r>
+        <w:fldChar w:fldCharType="begin"/>
+      </w:r>
+      <w:r>
+        <w:instrText xml:space="preserve"> SEQ Figure \* ARABIC</w:instrText>
+      </w:r>
+      <w:r>
+        <w:instrText xml:space="preserve"> </w:instrText>
+      </w:r>
+      <w:r>
+        <w:fldChar w:fldCharType="separate"/>
+      </w:r>
+      <w:r>
+        <w:rPr>
+          <w:noProof/>
+        </w:rPr>
+        <w:t>1</w:t>
+      </w:r>
+      <w:r>
+        <w:rPr>
+          <w:noProof/>
+        </w:rPr>
+        <w:fldChar w:fldCharType="end"/>
+      </w:r>
       <w:bookmarkEnd w:id="94"/>
       <w:r>
         <w:t xml:space="preserve"> : Carte Z</w:t>
@@ -9322,14 +9371,27 @@
       <w:r>
         <w:t xml:space="preserve">Figure </w:t>
       </w:r>
-      <w:fldSimple w:instr=" SEQ Figure \* ARABIC ">
-        <w:r>
-          <w:rPr>
-            <w:noProof/>
-          </w:rPr>
-          <w:t>2</w:t>
-        </w:r>
-      </w:fldSimple>
+      <w:r>
+        <w:fldChar w:fldCharType="begin"/>
+      </w:r>
+      <w:r>
+        <w:instrText xml:space="preserve"> SEQ Figure \* ARABIC </w:instrText>
+      </w:r>
+      <w:r>
+        <w:fldChar w:fldCharType="separate"/>
+      </w:r>
+      <w:r>
+        <w:rPr>
+          <w:noProof/>
+        </w:rPr>
+        <w:t>2</w:t>
+      </w:r>
+      <w:r>
+        <w:rPr>
+          <w:noProof/>
+        </w:rPr>
+        <w:fldChar w:fldCharType="end"/>
+      </w:r>
       <w:r>
         <w:t xml:space="preserve"> : Graphe J</w:t>
       </w:r>
@@ -9590,14 +9652,27 @@
                             <w:r>
                               <w:t xml:space="preserve">Figure </w:t>
                             </w:r>
-                            <w:fldSimple w:instr=" SEQ Figure \* ARABIC ">
-                              <w:r>
-                                <w:rPr>
-                                  <w:noProof/>
-                                </w:rPr>
-                                <w:t>3</w:t>
-                              </w:r>
-                            </w:fldSimple>
+                            <w:r>
+                              <w:fldChar w:fldCharType="begin"/>
+                            </w:r>
+                            <w:r>
+                              <w:instrText xml:space="preserve"> SEQ Figure \* ARABIC </w:instrText>
+                            </w:r>
+                            <w:r>
+                              <w:fldChar w:fldCharType="separate"/>
+                            </w:r>
+                            <w:r>
+                              <w:rPr>
+                                <w:noProof/>
+                              </w:rPr>
+                              <w:t>3</w:t>
+                            </w:r>
+                            <w:r>
+                              <w:rPr>
+                                <w:noProof/>
+                              </w:rPr>
+                              <w:fldChar w:fldCharType="end"/>
+                            </w:r>
                             <w:r>
                               <w:t xml:space="preserve"> : Graphe x</w:t>
                             </w:r>
@@ -9631,14 +9706,27 @@
                       <w:r>
                         <w:t xml:space="preserve">Figure </w:t>
                       </w:r>
-                      <w:fldSimple w:instr=" SEQ Figure \* ARABIC ">
-                        <w:r>
-                          <w:rPr>
-                            <w:noProof/>
-                          </w:rPr>
-                          <w:t>3</w:t>
-                        </w:r>
-                      </w:fldSimple>
+                      <w:r>
+                        <w:fldChar w:fldCharType="begin"/>
+                      </w:r>
+                      <w:r>
+                        <w:instrText xml:space="preserve"> SEQ Figure \* ARABIC </w:instrText>
+                      </w:r>
+                      <w:r>
+                        <w:fldChar w:fldCharType="separate"/>
+                      </w:r>
+                      <w:r>
+                        <w:rPr>
+                          <w:noProof/>
+                        </w:rPr>
+                        <w:t>3</w:t>
+                      </w:r>
+                      <w:r>
+                        <w:rPr>
+                          <w:noProof/>
+                        </w:rPr>
+                        <w:fldChar w:fldCharType="end"/>
+                      </w:r>
                       <w:r>
                         <w:t xml:space="preserve"> : Graphe x</w:t>
                       </w:r>
@@ -9704,14 +9792,27 @@
                             <w:r>
                               <w:t xml:space="preserve">Figure </w:t>
                             </w:r>
-                            <w:fldSimple w:instr=" SEQ Figure \* ARABIC ">
-                              <w:r>
-                                <w:rPr>
-                                  <w:noProof/>
-                                </w:rPr>
-                                <w:t>4</w:t>
-                              </w:r>
-                            </w:fldSimple>
+                            <w:r>
+                              <w:fldChar w:fldCharType="begin"/>
+                            </w:r>
+                            <w:r>
+                              <w:instrText xml:space="preserve"> SEQ Figure \* ARABIC </w:instrText>
+                            </w:r>
+                            <w:r>
+                              <w:fldChar w:fldCharType="separate"/>
+                            </w:r>
+                            <w:r>
+                              <w:rPr>
+                                <w:noProof/>
+                              </w:rPr>
+                              <w:t>4</w:t>
+                            </w:r>
+                            <w:r>
+                              <w:rPr>
+                                <w:noProof/>
+                              </w:rPr>
+                              <w:fldChar w:fldCharType="end"/>
+                            </w:r>
                             <w:r>
                               <w:t xml:space="preserve"> : Graphe y</w:t>
                             </w:r>
@@ -9745,14 +9846,27 @@
                       <w:r>
                         <w:t xml:space="preserve">Figure </w:t>
                       </w:r>
-                      <w:fldSimple w:instr=" SEQ Figure \* ARABIC ">
-                        <w:r>
-                          <w:rPr>
-                            <w:noProof/>
-                          </w:rPr>
-                          <w:t>4</w:t>
-                        </w:r>
-                      </w:fldSimple>
+                      <w:r>
+                        <w:fldChar w:fldCharType="begin"/>
+                      </w:r>
+                      <w:r>
+                        <w:instrText xml:space="preserve"> SEQ Figure \* ARABIC </w:instrText>
+                      </w:r>
+                      <w:r>
+                        <w:fldChar w:fldCharType="separate"/>
+                      </w:r>
+                      <w:r>
+                        <w:rPr>
+                          <w:noProof/>
+                        </w:rPr>
+                        <w:t>4</w:t>
+                      </w:r>
+                      <w:r>
+                        <w:rPr>
+                          <w:noProof/>
+                        </w:rPr>
+                        <w:fldChar w:fldCharType="end"/>
+                      </w:r>
                       <w:r>
                         <w:t xml:space="preserve"> : Graphe y</w:t>
                       </w:r>
@@ -9921,24 +10035,9 @@
       </w:pPr>
       <w:bookmarkStart w:id="96" w:name="_Toc430166141"/>
       <w:r>
-        <w:t xml:space="preserve">Principe et </w:t>
-      </w:r>
-      <w:commentRangeStart w:id="97"/>
-      <w:r>
-        <w:t>implémentation</w:t>
+        <w:t>Principe et implémentation</w:t>
       </w:r>
       <w:bookmarkEnd w:id="96"/>
-      <w:commentRangeEnd w:id="97"/>
-      <w:r>
-        <w:rPr>
-          <w:rStyle w:val="Marquedecommentaire"/>
-          <w:rFonts w:asciiTheme="minorHAnsi" w:eastAsiaTheme="minorEastAsia" w:hAnsiTheme="minorHAnsi" w:cstheme="minorBidi"/>
-          <w:b w:val="0"/>
-          <w:bCs w:val="0"/>
-          <w:color w:val="auto"/>
-        </w:rPr>
-        <w:commentReference w:id="97"/>
-      </w:r>
     </w:p>
     <w:p>
       <w:r>
@@ -9983,7 +10082,7 @@
       <w:r>
         <w:t>échelles</w:t>
       </w:r>
-      <w:ins w:id="98" w:author="Isabelle Gouttevin" w:date="2015-09-18T14:55:00Z">
+      <w:ins w:id="97" w:author="Isabelle Gouttevin" w:date="2015-09-18T14:55:00Z">
         <w:r>
           <w:t>, avec les étapes suivantes</w:t>
         </w:r>
@@ -10002,7 +10101,7 @@
         <w:spacing w:before="240"/>
         <w:rPr>
           <w:b/>
-          <w:rPrChange w:id="99" w:author="Isabelle Gouttevin" w:date="2015-09-18T15:23:00Z">
+          <w:rPrChange w:id="98" w:author="Isabelle Gouttevin" w:date="2015-09-18T15:23:00Z">
             <w:rPr/>
           </w:rPrChange>
         </w:rPr>
@@ -10010,7 +10109,7 @@
       <w:r>
         <w:rPr>
           <w:b/>
-          <w:rPrChange w:id="100" w:author="Isabelle Gouttevin" w:date="2015-09-18T15:23:00Z">
+          <w:rPrChange w:id="99" w:author="Isabelle Gouttevin" w:date="2015-09-18T15:23:00Z">
             <w:rPr/>
           </w:rPrChange>
         </w:rPr>
@@ -10029,22 +10128,22 @@
       <w:r>
         <w:t>Etablir si la HRU</w:t>
       </w:r>
-      <w:ins w:id="101" w:author="Isabelle Gouttevin" w:date="2015-09-18T15:15:00Z">
+      <w:ins w:id="100" w:author="Isabelle Gouttevin" w:date="2015-09-18T15:15:00Z">
         <w:r>
           <w:t xml:space="preserve"> </w:t>
         </w:r>
       </w:ins>
-      <w:del w:id="102" w:author="Isabelle Gouttevin" w:date="2015-09-18T15:15:00Z">
+      <w:del w:id="101" w:author="Isabelle Gouttevin" w:date="2015-09-18T15:15:00Z">
         <w:r>
           <w:delText xml:space="preserve"> </w:delText>
         </w:r>
       </w:del>
-      <w:ins w:id="103" w:author="Isabelle Gouttevin" w:date="2015-09-18T15:15:00Z">
+      <w:ins w:id="102" w:author="Isabelle Gouttevin" w:date="2015-09-18T15:15:00Z">
         <w:r>
           <w:t xml:space="preserve">doit être irriguée </w:t>
         </w:r>
       </w:ins>
-      <w:del w:id="104" w:author="Isabelle Gouttevin" w:date="2015-09-18T15:15:00Z">
+      <w:del w:id="103" w:author="Isabelle Gouttevin" w:date="2015-09-18T15:15:00Z">
         <w:r>
           <w:delText>est en état de stress</w:delText>
         </w:r>
@@ -10169,7 +10268,7 @@
       <w:r>
         <w:t>fixée dans les paramètres du modèle</w:t>
       </w:r>
-      <w:ins w:id="105" w:author="Isabelle Gouttevin" w:date="2015-09-18T15:15:00Z">
+      <w:ins w:id="104" w:author="Isabelle Gouttevin" w:date="2015-09-18T15:15:00Z">
         <w:r>
           <w:t xml:space="preserve"> (actuellement 0.9)</w:t>
         </w:r>
@@ -10177,7 +10276,7 @@
       <w:r>
         <w:t xml:space="preserve">, </w:t>
       </w:r>
-      <w:del w:id="106" w:author="Isabelle Gouttevin" w:date="2015-09-18T15:15:00Z">
+      <w:del w:id="105" w:author="Isabelle Gouttevin" w:date="2015-09-18T15:15:00Z">
         <w:r>
           <w:delText>alors</w:delText>
         </w:r>
@@ -10185,12 +10284,12 @@
       <w:r>
         <w:t xml:space="preserve"> la HRU </w:t>
       </w:r>
-      <w:del w:id="107" w:author="Isabelle Gouttevin" w:date="2015-09-18T15:16:00Z">
+      <w:del w:id="106" w:author="Isabelle Gouttevin" w:date="2015-09-18T15:16:00Z">
         <w:r>
           <w:delText xml:space="preserve">sera </w:delText>
         </w:r>
       </w:del>
-      <w:ins w:id="108" w:author="Isabelle Gouttevin" w:date="2015-09-18T15:16:00Z">
+      <w:ins w:id="107" w:author="Isabelle Gouttevin" w:date="2015-09-18T15:16:00Z">
         <w:r>
           <w:t xml:space="preserve">est considérée </w:t>
         </w:r>
@@ -10198,17 +10297,14 @@
       <w:r>
         <w:t xml:space="preserve">en stress hydrique et un besoin en eau d’irrigation </w:t>
       </w:r>
-      <w:del w:id="109" w:author="Isabelle Gouttevin" w:date="2015-09-18T15:16:00Z">
+      <w:del w:id="108" w:author="Isabelle Gouttevin" w:date="2015-09-18T15:16:00Z">
         <w:r>
           <w:delText xml:space="preserve">sera </w:delText>
         </w:r>
       </w:del>
-      <w:ins w:id="110" w:author="Isabelle Gouttevin" w:date="2015-09-18T15:16:00Z">
-        <w:r>
-          <w:t>est</w:t>
-        </w:r>
-        <w:r>
-          <w:t xml:space="preserve"> </w:t>
+      <w:ins w:id="109" w:author="Isabelle Gouttevin" w:date="2015-09-18T15:16:00Z">
+        <w:r>
+          <w:t xml:space="preserve">est </w:t>
         </w:r>
       </w:ins>
       <w:r>
@@ -10229,11 +10325,11 @@
           <w:numId w:val="36"/>
         </w:numPr>
         <w:rPr>
-          <w:ins w:id="111" w:author="Isabelle Gouttevin" w:date="2015-09-18T14:49:00Z"/>
+          <w:ins w:id="110" w:author="Isabelle Gouttevin" w:date="2015-09-18T14:49:00Z"/>
         </w:rPr>
       </w:pPr>
-      <w:commentRangeStart w:id="112"/>
-      <w:del w:id="113" w:author="Isabelle Gouttevin" w:date="2015-09-18T14:57:00Z">
+      <w:commentRangeStart w:id="111"/>
+      <w:del w:id="112" w:author="Isabelle Gouttevin" w:date="2015-09-18T14:57:00Z">
         <w:r>
           <w:delText xml:space="preserve">Calculer les besoins en eau : </w:delText>
         </w:r>
@@ -10247,22 +10343,22 @@
           <w:numId w:val="36"/>
         </w:numPr>
       </w:pPr>
-      <w:ins w:id="114" w:author="Isabelle Gouttevin" w:date="2015-09-18T14:49:00Z">
+      <w:ins w:id="113" w:author="Isabelle Gouttevin" w:date="2015-09-18T14:49:00Z">
         <w:r>
           <w:t xml:space="preserve">Calculer </w:t>
         </w:r>
       </w:ins>
-      <w:ins w:id="115" w:author="Isabelle Gouttevin" w:date="2015-09-18T14:57:00Z">
+      <w:ins w:id="114" w:author="Isabelle Gouttevin" w:date="2015-09-18T14:57:00Z">
         <w:r>
           <w:t xml:space="preserve">la dose d’irrigation, </w:t>
         </w:r>
       </w:ins>
-      <w:ins w:id="116" w:author="Isabelle Gouttevin" w:date="2015-09-18T15:16:00Z">
+      <w:ins w:id="115" w:author="Isabelle Gouttevin" w:date="2015-09-18T15:16:00Z">
         <w:r>
           <w:t>nécessaire à combler le besoin en eau des plantes</w:t>
         </w:r>
       </w:ins>
-      <w:ins w:id="117" w:author="Isabelle Gouttevin" w:date="2015-09-18T14:49:00Z">
+      <w:ins w:id="116" w:author="Isabelle Gouttevin" w:date="2015-09-18T14:49:00Z">
         <w:r>
           <w:t xml:space="preserve"> : </w:t>
         </w:r>
@@ -10285,12 +10381,12 @@
       <w:r>
         <w:t xml:space="preserve">). </w:t>
       </w:r>
-      <w:commentRangeEnd w:id="112"/>
+      <w:commentRangeEnd w:id="111"/>
       <w:r>
         <w:rPr>
           <w:rStyle w:val="Marquedecommentaire"/>
         </w:rPr>
-        <w:commentReference w:id="112"/>
+        <w:commentReference w:id="111"/>
       </w:r>
     </w:p>
     <w:p>
@@ -10303,14 +10399,27 @@
       <w:r>
         <w:t xml:space="preserve">Tableau </w:t>
       </w:r>
-      <w:fldSimple w:instr=" SEQ Tableau \* ARABIC ">
-        <w:r>
-          <w:rPr>
-            <w:noProof/>
-          </w:rPr>
-          <w:t>1</w:t>
-        </w:r>
-      </w:fldSimple>
+      <w:r>
+        <w:fldChar w:fldCharType="begin"/>
+      </w:r>
+      <w:r>
+        <w:instrText xml:space="preserve"> SEQ Tableau \* ARABIC </w:instrText>
+      </w:r>
+      <w:r>
+        <w:fldChar w:fldCharType="separate"/>
+      </w:r>
+      <w:r>
+        <w:rPr>
+          <w:noProof/>
+        </w:rPr>
+        <w:t>1</w:t>
+      </w:r>
+      <w:r>
+        <w:rPr>
+          <w:noProof/>
+        </w:rPr>
+        <w:fldChar w:fldCharType="end"/>
+      </w:r>
       <w:r>
         <w:t xml:space="preserve"> : Efficacité des systèmes d'irrigation</w:t>
       </w:r>
@@ -10810,7 +10919,7 @@
         <w:pStyle w:val="Paragraphedeliste"/>
         <w:ind w:left="1440"/>
         <w:rPr>
-          <w:ins w:id="118" w:author="Isabelle Gouttevin" w:date="2015-09-18T14:59:00Z"/>
+          <w:ins w:id="117" w:author="Isabelle Gouttevin" w:date="2015-09-18T14:59:00Z"/>
         </w:rPr>
       </w:pPr>
       <w:r>
@@ -10822,7 +10931,7 @@
       <w:r>
         <w:t xml:space="preserve">. Pour l’aspersion et le goutte-à-goutte, </w:t>
       </w:r>
-      <w:ins w:id="119" w:author="Isabelle Gouttevin" w:date="2015-09-18T15:18:00Z">
+      <w:ins w:id="118" w:author="Isabelle Gouttevin" w:date="2015-09-18T15:18:00Z">
         <w:r>
           <w:t xml:space="preserve">nous choisissons </w:t>
         </w:r>
@@ -10830,12 +10939,12 @@
       <w:r>
         <w:t xml:space="preserve">la dose d’irrigation </w:t>
       </w:r>
-      <w:del w:id="120" w:author="Isabelle Gouttevin" w:date="2015-09-18T15:18:00Z">
+      <w:del w:id="119" w:author="Isabelle Gouttevin" w:date="2015-09-18T15:18:00Z">
         <w:r>
           <w:delText>est égale à</w:delText>
         </w:r>
       </w:del>
-      <w:ins w:id="121" w:author="Isabelle Gouttevin" w:date="2015-09-18T15:18:00Z">
+      <w:ins w:id="120" w:author="Isabelle Gouttevin" w:date="2015-09-18T15:18:00Z">
         <w:r>
           <w:t>comme</w:t>
         </w:r>
@@ -10843,7 +10952,7 @@
       <w:r>
         <w:t xml:space="preserve"> la quantité d’eau nécessaire à apporter pour remplir le réservoir MPS</w:t>
       </w:r>
-      <w:ins w:id="122" w:author="Isabelle Gouttevin" w:date="2015-09-18T14:53:00Z">
+      <w:ins w:id="121" w:author="Isabelle Gouttevin" w:date="2015-09-18T14:53:00Z">
         <w:r>
           <w:t xml:space="preserve"> (Medium Pore </w:t>
         </w:r>
@@ -10856,7 +10965,7 @@
           <w:t>)</w:t>
         </w:r>
       </w:ins>
-      <w:ins w:id="123" w:author="Isabelle Gouttevin" w:date="2015-09-18T15:18:00Z">
+      <w:ins w:id="122" w:author="Isabelle Gouttevin" w:date="2015-09-18T15:18:00Z">
         <w:r>
           <w:t>,</w:t>
         </w:r>
@@ -10864,7 +10973,7 @@
       <w:r>
         <w:t xml:space="preserve"> dans lequel la plante va puiser l’eau pour parvenir à l’évapotranspiration maximale. </w:t>
       </w:r>
-      <w:ins w:id="124" w:author="Isabelle Gouttevin" w:date="2015-09-18T14:51:00Z">
+      <w:ins w:id="123" w:author="Isabelle Gouttevin" w:date="2015-09-18T14:51:00Z">
         <w:r>
           <w:t xml:space="preserve"> Rappelons que le MPS est défini par la capacité au cha</w:t>
         </w:r>
@@ -10872,17 +10981,17 @@
           <w:t>mp du sol de la HRU sur la prof</w:t>
         </w:r>
       </w:ins>
-      <w:ins w:id="125" w:author="Isabelle Gouttevin" w:date="2015-09-18T14:53:00Z">
+      <w:ins w:id="124" w:author="Isabelle Gouttevin" w:date="2015-09-18T14:53:00Z">
         <w:r>
           <w:t>o</w:t>
         </w:r>
       </w:ins>
-      <w:ins w:id="126" w:author="Isabelle Gouttevin" w:date="2015-09-18T14:51:00Z">
+      <w:ins w:id="125" w:author="Isabelle Gouttevin" w:date="2015-09-18T14:51:00Z">
         <w:r>
           <w:t xml:space="preserve">ndeur racinaire de la culture </w:t>
         </w:r>
       </w:ins>
-      <w:ins w:id="127" w:author="Isabelle Gouttevin" w:date="2015-09-18T14:53:00Z">
+      <w:ins w:id="126" w:author="Isabelle Gouttevin" w:date="2015-09-18T14:53:00Z">
         <w:r>
           <w:t xml:space="preserve">en terre. </w:t>
         </w:r>
@@ -10890,7 +10999,7 @@
       <w:r>
         <w:t>Pour l’irrigation gravitaire, nous considérons que la dose correspond à l’eau à apporter pour remplir les deux réservoirs de sol, MPS et LPS</w:t>
       </w:r>
-      <w:ins w:id="128" w:author="Isabelle Gouttevin" w:date="2015-09-18T14:54:00Z">
+      <w:ins w:id="127" w:author="Isabelle Gouttevin" w:date="2015-09-18T14:54:00Z">
         <w:r>
           <w:t xml:space="preserve"> (Large Pore </w:t>
         </w:r>
@@ -10906,7 +11015,7 @@
       <w:r>
         <w:t>.</w:t>
       </w:r>
-      <w:ins w:id="129" w:author="Isabelle Gouttevin" w:date="2015-09-18T15:19:00Z">
+      <w:ins w:id="128" w:author="Isabelle Gouttevin" w:date="2015-09-18T15:19:00Z">
         <w:r>
           <w:t xml:space="preserve"> Ces choix respectent les fonctionnements et efficacités respectifs de ces types d’irrigation</w:t>
         </w:r>
@@ -10917,7 +11026,7 @@
         <w:pStyle w:val="Paragraphedeliste"/>
         <w:ind w:left="1440"/>
         <w:rPr>
-          <w:ins w:id="130" w:author="Isabelle Gouttevin" w:date="2015-09-18T14:59:00Z"/>
+          <w:ins w:id="129" w:author="Isabelle Gouttevin" w:date="2015-09-18T14:59:00Z"/>
         </w:rPr>
       </w:pPr>
     </w:p>
@@ -10929,115 +11038,115 @@
           <w:numId w:val="41"/>
         </w:numPr>
         <w:rPr>
-          <w:ins w:id="131" w:author="Isabelle Gouttevin" w:date="2015-09-18T15:20:00Z"/>
+          <w:ins w:id="130" w:author="Isabelle Gouttevin" w:date="2015-09-18T15:20:00Z"/>
         </w:rPr>
-        <w:pPrChange w:id="132" w:author="Isabelle Gouttevin" w:date="2015-09-18T15:06:00Z">
+        <w:pPrChange w:id="131" w:author="Isabelle Gouttevin" w:date="2015-09-18T15:06:00Z">
           <w:pPr>
             <w:pStyle w:val="Paragraphedeliste"/>
           </w:pPr>
         </w:pPrChange>
       </w:pPr>
-      <w:ins w:id="133" w:author="Isabelle Gouttevin" w:date="2015-09-18T14:59:00Z">
+      <w:ins w:id="132" w:author="Isabelle Gouttevin" w:date="2015-09-18T14:59:00Z">
         <w:r>
           <w:t>Calculer l’eau</w:t>
         </w:r>
       </w:ins>
-      <w:ins w:id="134" w:author="Isabelle Gouttevin" w:date="2015-09-18T15:10:00Z">
+      <w:ins w:id="133" w:author="Isabelle Gouttevin" w:date="2015-09-18T15:10:00Z">
         <w:r>
           <w:t xml:space="preserve"> à </w:t>
         </w:r>
       </w:ins>
-      <w:ins w:id="135" w:author="Isabelle Gouttevin" w:date="2015-09-18T14:59:00Z">
+      <w:ins w:id="134" w:author="Isabelle Gouttevin" w:date="2015-09-18T14:59:00Z">
         <w:r>
           <w:t>prélev</w:t>
         </w:r>
       </w:ins>
-      <w:ins w:id="136" w:author="Isabelle Gouttevin" w:date="2015-09-18T15:10:00Z">
+      <w:ins w:id="135" w:author="Isabelle Gouttevin" w:date="2015-09-18T15:10:00Z">
         <w:r>
           <w:t>er</w:t>
         </w:r>
       </w:ins>
-      <w:ins w:id="137" w:author="Isabelle Gouttevin" w:date="2015-09-18T14:59:00Z">
+      <w:ins w:id="136" w:author="Isabelle Gouttevin" w:date="2015-09-18T14:59:00Z">
         <w:r>
           <w:t xml:space="preserve"> (</w:t>
         </w:r>
       </w:ins>
-      <w:ins w:id="138" w:author="Isabelle Gouttevin" w:date="2015-09-18T15:10:00Z">
+      <w:ins w:id="137" w:author="Isabelle Gouttevin" w:date="2015-09-18T15:10:00Z">
         <w:r>
           <w:t xml:space="preserve">paramétrisation </w:t>
         </w:r>
       </w:ins>
-      <w:ins w:id="139" w:author="Isabelle Gouttevin" w:date="2015-09-18T14:59:00Z">
+      <w:ins w:id="138" w:author="Isabelle Gouttevin" w:date="2015-09-18T14:59:00Z">
         <w:r>
           <w:t xml:space="preserve">à </w:t>
         </w:r>
       </w:ins>
-      <w:ins w:id="140" w:author="Isabelle Gouttevin" w:date="2015-09-18T15:10:00Z">
+      <w:ins w:id="139" w:author="Isabelle Gouttevin" w:date="2015-09-18T15:10:00Z">
         <w:r>
           <w:t>affiner</w:t>
         </w:r>
       </w:ins>
-      <w:ins w:id="141" w:author="Isabelle Gouttevin" w:date="2015-09-18T14:59:00Z">
+      <w:ins w:id="140" w:author="Isabelle Gouttevin" w:date="2015-09-18T14:59:00Z">
         <w:r>
           <w:t xml:space="preserve"> ultérieurement) : les systèmes d</w:t>
         </w:r>
       </w:ins>
-      <w:ins w:id="142" w:author="Isabelle Gouttevin" w:date="2015-09-18T15:00:00Z">
+      <w:ins w:id="141" w:author="Isabelle Gouttevin" w:date="2015-09-18T15:00:00Z">
         <w:r>
           <w:t>’irrigations ne sont pas à 100% efficaces</w:t>
         </w:r>
       </w:ins>
-      <w:ins w:id="143" w:author="Isabelle Gouttevin" w:date="2015-09-18T15:11:00Z">
+      <w:ins w:id="142" w:author="Isabelle Gouttevin" w:date="2015-09-18T15:11:00Z">
         <w:r>
           <w:t>. Ainsi, la dose à prélever doit être</w:t>
         </w:r>
       </w:ins>
-      <w:ins w:id="144" w:author="Isabelle Gouttevin" w:date="2015-09-18T15:19:00Z">
+      <w:ins w:id="143" w:author="Isabelle Gouttevin" w:date="2015-09-18T15:19:00Z">
         <w:r>
           <w:t>, théoriquement,</w:t>
         </w:r>
       </w:ins>
-      <w:ins w:id="145" w:author="Isabelle Gouttevin" w:date="2015-09-18T15:11:00Z">
+      <w:ins w:id="144" w:author="Isabelle Gouttevin" w:date="2015-09-18T15:11:00Z">
         <w:r>
           <w:t xml:space="preserve"> supérieure à la dose d’irrigation calculée précédemment.</w:t>
         </w:r>
       </w:ins>
-      <w:ins w:id="146" w:author="Isabelle Gouttevin" w:date="2015-09-18T15:12:00Z">
+      <w:ins w:id="145" w:author="Isabelle Gouttevin" w:date="2015-09-18T15:12:00Z">
         <w:r>
           <w:t xml:space="preserve"> O</w:t>
         </w:r>
       </w:ins>
-      <w:ins w:id="147" w:author="Isabelle Gouttevin" w:date="2015-09-18T15:00:00Z">
+      <w:ins w:id="146" w:author="Isabelle Gouttevin" w:date="2015-09-18T15:00:00Z">
         <w:r>
           <w:t>n pourra ajouter au modèle, dans une phase d’approfondissement, un coefficient d’efficacité propre à chaque type d</w:t>
         </w:r>
       </w:ins>
-      <w:ins w:id="148" w:author="Isabelle Gouttevin" w:date="2015-09-18T15:01:00Z">
+      <w:ins w:id="147" w:author="Isabelle Gouttevin" w:date="2015-09-18T15:01:00Z">
         <w:r>
           <w:t xml:space="preserve">’irrigation. </w:t>
         </w:r>
       </w:ins>
-      <w:ins w:id="149" w:author="Isabelle Gouttevin" w:date="2015-09-18T15:09:00Z">
+      <w:ins w:id="148" w:author="Isabelle Gouttevin" w:date="2015-09-18T15:09:00Z">
         <w:r>
           <w:t>Pour l’heure, les réseau</w:t>
         </w:r>
       </w:ins>
-      <w:ins w:id="150" w:author="Isabelle Gouttevin" w:date="2015-09-18T15:12:00Z">
+      <w:ins w:id="149" w:author="Isabelle Gouttevin" w:date="2015-09-18T15:12:00Z">
         <w:r>
           <w:t>x</w:t>
         </w:r>
       </w:ins>
-      <w:ins w:id="151" w:author="Isabelle Gouttevin" w:date="2015-09-18T15:09:00Z">
+      <w:ins w:id="150" w:author="Isabelle Gouttevin" w:date="2015-09-18T15:09:00Z">
         <w:r>
           <w:t xml:space="preserve"> d’irrigation sont considérés efficaces et ces coefficients valent 1</w:t>
         </w:r>
       </w:ins>
-      <w:ins w:id="152" w:author="Isabelle Gouttevin" w:date="2015-09-18T15:12:00Z">
+      <w:ins w:id="151" w:author="Isabelle Gouttevin" w:date="2015-09-18T15:12:00Z">
         <w:r>
           <w:t xml:space="preserve"> (dose à prélevée = dose d’irrigation)</w:t>
         </w:r>
       </w:ins>
-      <w:ins w:id="153" w:author="Isabelle Gouttevin" w:date="2015-09-18T15:09:00Z">
+      <w:ins w:id="152" w:author="Isabelle Gouttevin" w:date="2015-09-18T15:09:00Z">
         <w:r>
           <w:t>.</w:t>
         </w:r>
@@ -11051,41 +11160,41 @@
           <w:numId w:val="41"/>
         </w:numPr>
         <w:rPr>
-          <w:del w:id="154" w:author="Isabelle Gouttevin" w:date="2015-09-18T15:06:00Z"/>
+          <w:del w:id="153" w:author="Isabelle Gouttevin" w:date="2015-09-18T15:06:00Z"/>
         </w:rPr>
-        <w:pPrChange w:id="155" w:author="Isabelle Gouttevin" w:date="2015-09-18T15:06:00Z">
+        <w:pPrChange w:id="154" w:author="Isabelle Gouttevin" w:date="2015-09-18T15:06:00Z">
           <w:pPr>
             <w:pStyle w:val="Paragraphedeliste"/>
           </w:pPr>
         </w:pPrChange>
       </w:pPr>
-      <w:ins w:id="156" w:author="Isabelle Gouttevin" w:date="2015-09-18T15:20:00Z">
+      <w:ins w:id="155" w:author="Isabelle Gouttevin" w:date="2015-09-18T15:20:00Z">
         <w:r>
           <w:lastRenderedPageBreak/>
           <w:t>Dans la réalité, l</w:t>
         </w:r>
       </w:ins>
-      <w:ins w:id="157" w:author="Isabelle Gouttevin" w:date="2015-09-18T15:01:00Z">
+      <w:ins w:id="156" w:author="Isabelle Gouttevin" w:date="2015-09-18T15:01:00Z">
         <w:r>
           <w:t>orsque le réseau d’apport de l’eau est peu efficace, l</w:t>
         </w:r>
       </w:ins>
-      <w:ins w:id="158" w:author="Isabelle Gouttevin" w:date="2015-09-18T15:02:00Z">
+      <w:ins w:id="157" w:author="Isabelle Gouttevin" w:date="2015-09-18T15:02:00Z">
         <w:r>
           <w:t xml:space="preserve">’eau </w:t>
         </w:r>
       </w:ins>
-      <w:ins w:id="159" w:author="Isabelle Gouttevin" w:date="2015-09-18T15:01:00Z">
+      <w:ins w:id="158" w:author="Isabelle Gouttevin" w:date="2015-09-18T15:01:00Z">
         <w:r>
           <w:t xml:space="preserve"> « perdue »</w:t>
         </w:r>
       </w:ins>
-      <w:ins w:id="160" w:author="Isabelle Gouttevin" w:date="2015-09-18T15:02:00Z">
+      <w:ins w:id="159" w:author="Isabelle Gouttevin" w:date="2015-09-18T15:02:00Z">
         <w:r>
           <w:t xml:space="preserve"> est en fait restituée au milieu entre son point de prélèvement et son point d’usage. Notre choix de point de prélèvement étant actuellement le brin de rivière le plus proche de la HRU</w:t>
         </w:r>
       </w:ins>
-      <w:ins w:id="161" w:author="Isabelle Gouttevin" w:date="2015-09-18T15:12:00Z">
+      <w:ins w:id="160" w:author="Isabelle Gouttevin" w:date="2015-09-18T15:12:00Z">
         <w:r>
           <w:t xml:space="preserve"> (</w:t>
         </w:r>
@@ -11098,7 +11207,7 @@
           <w:t xml:space="preserve"> partie suivante)</w:t>
         </w:r>
       </w:ins>
-      <w:ins w:id="162" w:author="Isabelle Gouttevin" w:date="2015-09-18T15:02:00Z">
+      <w:ins w:id="161" w:author="Isabelle Gouttevin" w:date="2015-09-18T15:02:00Z">
         <w:r>
           <w:t>, et non pas le point r</w:t>
         </w:r>
@@ -11109,52 +11218,52 @@
           <w:t xml:space="preserve"> faute de données suffisamment précises à l</w:t>
         </w:r>
       </w:ins>
-      <w:ins w:id="163" w:author="Isabelle Gouttevin" w:date="2015-09-18T15:03:00Z">
+      <w:ins w:id="162" w:author="Isabelle Gouttevin" w:date="2015-09-18T15:03:00Z">
         <w:r>
           <w:t xml:space="preserve">’échelle du bassin du Rhône, </w:t>
         </w:r>
       </w:ins>
-      <w:ins w:id="164" w:author="Isabelle Gouttevin" w:date="2015-09-18T15:05:00Z">
+      <w:ins w:id="163" w:author="Isabelle Gouttevin" w:date="2015-09-18T15:05:00Z">
         <w:r>
           <w:t>les linéaires d’apport d’eau pour l’irrigation ont, dans notre modélisation, une longueur</w:t>
         </w:r>
       </w:ins>
-      <w:ins w:id="165" w:author="Isabelle Gouttevin" w:date="2015-09-18T15:07:00Z">
+      <w:ins w:id="164" w:author="Isabelle Gouttevin" w:date="2015-09-18T15:07:00Z">
         <w:r>
           <w:t xml:space="preserve"> faible (canaux d’irrigation non-représentés)</w:t>
         </w:r>
       </w:ins>
-      <w:ins w:id="166" w:author="Isabelle Gouttevin" w:date="2015-09-18T15:08:00Z">
+      <w:ins w:id="165" w:author="Isabelle Gouttevin" w:date="2015-09-18T15:08:00Z">
         <w:r>
           <w:t>, et ils restent proches de leur rivière d’origine</w:t>
         </w:r>
       </w:ins>
-      <w:ins w:id="167" w:author="Isabelle Gouttevin" w:date="2015-09-18T15:05:00Z">
+      <w:ins w:id="166" w:author="Isabelle Gouttevin" w:date="2015-09-18T15:05:00Z">
         <w:r>
           <w:t xml:space="preserve">. On peut considérer que </w:t>
         </w:r>
       </w:ins>
-      <w:ins w:id="168" w:author="Isabelle Gouttevin" w:date="2015-09-18T15:03:00Z">
+      <w:ins w:id="167" w:author="Isabelle Gouttevin" w:date="2015-09-18T15:03:00Z">
         <w:r>
           <w:t>la non-représentation d</w:t>
         </w:r>
       </w:ins>
-      <w:ins w:id="169" w:author="Isabelle Gouttevin" w:date="2015-09-18T15:06:00Z">
+      <w:ins w:id="168" w:author="Isabelle Gouttevin" w:date="2015-09-18T15:06:00Z">
         <w:r>
           <w:t xml:space="preserve">’une </w:t>
         </w:r>
       </w:ins>
-      <w:ins w:id="170" w:author="Isabelle Gouttevin" w:date="2015-09-18T15:03:00Z">
+      <w:ins w:id="169" w:author="Isabelle Gouttevin" w:date="2015-09-18T15:03:00Z">
         <w:r>
           <w:t xml:space="preserve">perte </w:t>
         </w:r>
       </w:ins>
-      <w:ins w:id="171" w:author="Isabelle Gouttevin" w:date="2015-09-18T15:08:00Z">
+      <w:ins w:id="170" w:author="Isabelle Gouttevin" w:date="2015-09-18T15:08:00Z">
         <w:r>
           <w:t xml:space="preserve">en ligne </w:t>
         </w:r>
       </w:ins>
-      <w:ins w:id="172" w:author="Isabelle Gouttevin" w:date="2015-09-18T15:06:00Z">
+      <w:ins w:id="171" w:author="Isabelle Gouttevin" w:date="2015-09-18T15:06:00Z">
         <w:r>
           <w:t xml:space="preserve">le long de ces linéaires a un impact faible sur l’hydrologie </w:t>
         </w:r>
@@ -11163,12 +11272,12 @@
           <w:t>de</w:t>
         </w:r>
       </w:ins>
-      <w:ins w:id="173" w:author="Isabelle Gouttevin" w:date="2015-09-18T15:04:00Z">
+      <w:ins w:id="172" w:author="Isabelle Gouttevin" w:date="2015-09-18T15:04:00Z">
         <w:r>
           <w:t>s-bassin</w:t>
         </w:r>
       </w:ins>
-      <w:ins w:id="174" w:author="Isabelle Gouttevin" w:date="2015-09-18T15:06:00Z">
+      <w:ins w:id="173" w:author="Isabelle Gouttevin" w:date="2015-09-18T15:06:00Z">
         <w:r>
           <w:t>s.</w:t>
         </w:r>
@@ -11182,9 +11291,9 @@
           <w:numId w:val="41"/>
         </w:numPr>
         <w:rPr>
-          <w:del w:id="175" w:author="Isabelle Gouttevin" w:date="2015-09-18T15:06:00Z"/>
+          <w:del w:id="174" w:author="Isabelle Gouttevin" w:date="2015-09-18T15:06:00Z"/>
         </w:rPr>
-        <w:pPrChange w:id="176" w:author="Isabelle Gouttevin" w:date="2015-09-18T15:06:00Z">
+        <w:pPrChange w:id="175" w:author="Isabelle Gouttevin" w:date="2015-09-18T15:06:00Z">
           <w:pPr>
             <w:pStyle w:val="Paragraphedeliste"/>
             <w:ind w:left="1440"/>
@@ -11200,24 +11309,24 @@
           <w:numId w:val="36"/>
         </w:numPr>
         <w:rPr>
-          <w:del w:id="177" w:author="Isabelle Gouttevin" w:date="2015-09-18T15:22:00Z"/>
+          <w:del w:id="176" w:author="Isabelle Gouttevin" w:date="2015-09-18T15:22:00Z"/>
         </w:rPr>
       </w:pPr>
       <w:r>
         <w:t>Appli</w:t>
       </w:r>
-      <w:ins w:id="178" w:author="Isabelle Gouttevin" w:date="2015-09-18T14:55:00Z">
+      <w:ins w:id="177" w:author="Isabelle Gouttevin" w:date="2015-09-18T14:55:00Z">
         <w:r>
           <w:t>quer</w:t>
         </w:r>
       </w:ins>
       <w:proofErr w:type="spellEnd"/>
-      <w:del w:id="179" w:author="Isabelle Gouttevin" w:date="2015-09-18T14:55:00Z">
+      <w:del w:id="178" w:author="Isabelle Gouttevin" w:date="2015-09-18T14:55:00Z">
         <w:r>
           <w:delText>cation</w:delText>
         </w:r>
       </w:del>
-      <w:del w:id="180" w:author="Isabelle Gouttevin" w:date="2015-09-18T15:21:00Z">
+      <w:del w:id="179" w:author="Isabelle Gouttevin" w:date="2015-09-18T15:21:00Z">
         <w:r>
           <w:delText xml:space="preserve"> de</w:delText>
         </w:r>
@@ -11231,74 +11340,74 @@
       <w:r>
         <w:t>i l</w:t>
       </w:r>
-      <w:ins w:id="181" w:author="Isabelle Gouttevin" w:date="2015-09-18T15:22:00Z">
+      <w:ins w:id="180" w:author="Isabelle Gouttevin" w:date="2015-09-18T15:22:00Z">
         <w:r>
           <w:t>a</w:t>
         </w:r>
       </w:ins>
+      <w:del w:id="181" w:author="Isabelle Gouttevin" w:date="2015-09-18T15:22:00Z">
+        <w:r>
+          <w:delText>es</w:delText>
+        </w:r>
+      </w:del>
+      <w:r>
+        <w:t xml:space="preserve"> ressource</w:t>
+      </w:r>
       <w:del w:id="182" w:author="Isabelle Gouttevin" w:date="2015-09-18T15:22:00Z">
         <w:r>
-          <w:delText>es</w:delText>
+          <w:delText>s</w:delText>
         </w:r>
       </w:del>
       <w:r>
-        <w:t xml:space="preserve"> ressource</w:t>
-      </w:r>
-      <w:del w:id="183" w:author="Isabelle Gouttevin" w:date="2015-09-18T15:22:00Z">
-        <w:r>
-          <w:delText>s</w:delText>
+        <w:t xml:space="preserve"> </w:t>
+      </w:r>
+      <w:r>
+        <w:t>dans le cours d’eau</w:t>
+      </w:r>
+      <w:ins w:id="183" w:author="Isabelle Gouttevin" w:date="2015-09-18T15:22:00Z">
+        <w:r>
+          <w:t xml:space="preserve"> auquel est connecté la HRU (</w:t>
+        </w:r>
+        <w:proofErr w:type="spellStart"/>
+        <w:r>
+          <w:t>cf</w:t>
+        </w:r>
+        <w:proofErr w:type="spellEnd"/>
+        <w:r>
+          <w:t xml:space="preserve"> partie suivante)</w:t>
+        </w:r>
+      </w:ins>
+      <w:r>
+        <w:t xml:space="preserve"> </w:t>
+      </w:r>
+      <w:r>
+        <w:t>le permet</w:t>
+      </w:r>
+      <w:del w:id="184" w:author="Isabelle Gouttevin" w:date="2015-09-18T15:22:00Z">
+        <w:r>
+          <w:delText>tent</w:delText>
         </w:r>
       </w:del>
       <w:r>
-        <w:t xml:space="preserve"> </w:t>
-      </w:r>
-      <w:r>
-        <w:t>dans le cours d’eau</w:t>
-      </w:r>
-      <w:ins w:id="184" w:author="Isabelle Gouttevin" w:date="2015-09-18T15:22:00Z">
-        <w:r>
-          <w:t xml:space="preserve"> auquel est connecté la HRU (</w:t>
-        </w:r>
-        <w:proofErr w:type="spellStart"/>
-        <w:r>
-          <w:t>cf</w:t>
-        </w:r>
-        <w:proofErr w:type="spellEnd"/>
-        <w:r>
-          <w:t xml:space="preserve"> partie suivante)</w:t>
+        <w:t xml:space="preserve">, la </w:t>
+      </w:r>
+      <w:del w:id="185" w:author="Isabelle Gouttevin" w:date="2015-09-18T15:21:00Z">
+        <w:r>
+          <w:delText>demande calculée</w:delText>
+        </w:r>
+      </w:del>
+      <w:ins w:id="186" w:author="Isabelle Gouttevin" w:date="2015-09-18T15:21:00Z">
+        <w:r>
+          <w:t>dose d’irrigation</w:t>
         </w:r>
       </w:ins>
       <w:r>
-        <w:t xml:space="preserve"> </w:t>
-      </w:r>
-      <w:r>
-        <w:t>le permet</w:t>
-      </w:r>
-      <w:del w:id="185" w:author="Isabelle Gouttevin" w:date="2015-09-18T15:22:00Z">
-        <w:r>
-          <w:delText>tent</w:delText>
-        </w:r>
-      </w:del>
-      <w:r>
-        <w:t xml:space="preserve">, la </w:t>
-      </w:r>
-      <w:del w:id="186" w:author="Isabelle Gouttevin" w:date="2015-09-18T15:21:00Z">
-        <w:r>
-          <w:delText>demande calculée</w:delText>
-        </w:r>
-      </w:del>
-      <w:ins w:id="187" w:author="Isabelle Gouttevin" w:date="2015-09-18T15:21:00Z">
-        <w:r>
-          <w:t>dose d’irrigation</w:t>
-        </w:r>
-      </w:ins>
-      <w:r>
         <w:t xml:space="preserve"> est appliquée sur les HRUs irriguées</w:t>
       </w:r>
       <w:r>
         <w:t xml:space="preserve">. </w:t>
       </w:r>
-      <w:del w:id="188" w:author="Isabelle Gouttevin" w:date="2015-09-18T15:22:00Z">
+      <w:del w:id="187" w:author="Isabelle Gouttevin" w:date="2015-09-18T15:22:00Z">
         <w:r>
           <w:delText>La perte dans les conduites n’est pas prise en compte pour l’instant. Ainsi, l’eau prélevée</w:delText>
         </w:r>
@@ -11327,7 +11436,7 @@
         <w:pStyle w:val="Paragraphedeliste"/>
         <w:ind w:left="1440"/>
         <w:rPr>
-          <w:del w:id="189" w:author="Isabelle Gouttevin" w:date="2015-09-18T15:39:00Z"/>
+          <w:del w:id="188" w:author="Isabelle Gouttevin" w:date="2015-09-18T15:39:00Z"/>
         </w:rPr>
       </w:pPr>
     </w:p>
@@ -11336,10 +11445,10 @@
         <w:spacing w:after="200"/>
         <w:jc w:val="left"/>
         <w:rPr>
-          <w:del w:id="190" w:author="Isabelle Gouttevin" w:date="2015-09-18T15:39:00Z"/>
+          <w:del w:id="189" w:author="Isabelle Gouttevin" w:date="2015-09-18T15:39:00Z"/>
         </w:rPr>
       </w:pPr>
-      <w:del w:id="191" w:author="Isabelle Gouttevin" w:date="2015-09-18T15:39:00Z">
+      <w:del w:id="190" w:author="Isabelle Gouttevin" w:date="2015-09-18T15:39:00Z">
         <w:r>
           <w:br w:type="page"/>
         </w:r>
@@ -11351,11 +11460,11 @@
         <w:jc w:val="left"/>
         <w:rPr>
           <w:b/>
-          <w:rPrChange w:id="192" w:author="Isabelle Gouttevin" w:date="2015-09-18T15:23:00Z">
+          <w:rPrChange w:id="191" w:author="Isabelle Gouttevin" w:date="2015-09-18T15:23:00Z">
             <w:rPr/>
           </w:rPrChange>
         </w:rPr>
-        <w:pPrChange w:id="193" w:author="Isabelle Gouttevin" w:date="2015-09-18T15:39:00Z">
+        <w:pPrChange w:id="192" w:author="Isabelle Gouttevin" w:date="2015-09-18T15:39:00Z">
           <w:pPr>
             <w:pStyle w:val="Paragraphedeliste"/>
             <w:numPr>
@@ -11369,7 +11478,7 @@
       <w:r>
         <w:rPr>
           <w:b/>
-          <w:rPrChange w:id="194" w:author="Isabelle Gouttevin" w:date="2015-09-18T15:23:00Z">
+          <w:rPrChange w:id="193" w:author="Isabelle Gouttevin" w:date="2015-09-18T15:23:00Z">
             <w:rPr/>
           </w:rPrChange>
         </w:rPr>
@@ -11377,6 +11486,15 @@
         <w:t>A</w:t>
       </w:r>
       <w:proofErr w:type="spellEnd"/>
+      <w:r>
+        <w:rPr>
+          <w:b/>
+          <w:rPrChange w:id="194" w:author="Isabelle Gouttevin" w:date="2015-09-18T15:23:00Z">
+            <w:rPr/>
+          </w:rPrChange>
+        </w:rPr>
+        <w:t xml:space="preserve"> l’échelle </w:t>
+      </w:r>
       <w:r>
         <w:rPr>
           <w:b/>
@@ -11384,7 +11502,7 @@
             <w:rPr/>
           </w:rPrChange>
         </w:rPr>
-        <w:t xml:space="preserve"> l’échelle </w:t>
+        <w:t>du brin de rivière a</w:t>
       </w:r>
       <w:r>
         <w:rPr>
@@ -11393,7 +11511,7 @@
             <w:rPr/>
           </w:rPrChange>
         </w:rPr>
-        <w:t>du brin de rivière a</w:t>
+        <w:t>uquel est connecté la HRU</w:t>
       </w:r>
       <w:r>
         <w:rPr>
@@ -11402,15 +11520,6 @@
             <w:rPr/>
           </w:rPrChange>
         </w:rPr>
-        <w:t>uquel est connecté la HRU</w:t>
-      </w:r>
-      <w:r>
-        <w:rPr>
-          <w:b/>
-          <w:rPrChange w:id="198" w:author="Isabelle Gouttevin" w:date="2015-09-18T15:23:00Z">
-            <w:rPr/>
-          </w:rPrChange>
-        </w:rPr>
         <w:t> :</w:t>
       </w:r>
     </w:p>
@@ -11473,16 +11582,16 @@
       <w:r>
         <w:t xml:space="preserve">brin : </w:t>
       </w:r>
-      <w:commentRangeStart w:id="199"/>
+      <w:commentRangeStart w:id="198"/>
       <w:r>
         <w:t>en fonction de la ressource dans le brin</w:t>
       </w:r>
-      <w:commentRangeEnd w:id="199"/>
+      <w:commentRangeEnd w:id="198"/>
       <w:r>
         <w:rPr>
           <w:rStyle w:val="Marquedecommentaire"/>
         </w:rPr>
-        <w:commentReference w:id="199"/>
+        <w:commentReference w:id="198"/>
       </w:r>
       <w:r>
         <w:t>, l’eau est prélevée pour satisfaire la demande.</w:t>
@@ -11527,7 +11636,7 @@
           <w:numId w:val="43"/>
         </w:numPr>
         <w:spacing w:after="0"/>
-        <w:pPrChange w:id="200" w:author="Isabelle Gouttevin" w:date="2015-09-18T15:26:00Z">
+        <w:pPrChange w:id="199" w:author="Isabelle Gouttevin" w:date="2015-09-18T15:26:00Z">
           <w:pPr>
             <w:spacing w:after="0"/>
           </w:pPr>
@@ -11560,7 +11669,7 @@
       <w:r>
         <w:t>correspond</w:t>
       </w:r>
-      <w:del w:id="201" w:author="Isabelle Gouttevin" w:date="2015-09-18T15:25:00Z">
+      <w:del w:id="200" w:author="Isabelle Gouttevin" w:date="2015-09-18T15:25:00Z">
         <w:r>
           <w:delText>r</w:delText>
         </w:r>
@@ -11583,7 +11692,7 @@
           <w:numId w:val="43"/>
         </w:numPr>
         <w:spacing w:after="0"/>
-        <w:pPrChange w:id="202" w:author="Isabelle Gouttevin" w:date="2015-09-18T15:31:00Z">
+        <w:pPrChange w:id="201" w:author="Isabelle Gouttevin" w:date="2015-09-18T15:31:00Z">
           <w:pPr>
             <w:spacing w:after="0"/>
           </w:pPr>
@@ -11595,7 +11704,7 @@
       <w:r>
         <w:t xml:space="preserve"> le module décrit ci-dessus</w:t>
       </w:r>
-      <w:ins w:id="203" w:author="Isabelle Gouttevin" w:date="2015-09-18T15:31:00Z">
+      <w:ins w:id="202" w:author="Isabelle Gouttevin" w:date="2015-09-18T15:31:00Z">
         <w:r>
           <w:t xml:space="preserve">, pour le </w:t>
         </w:r>
@@ -11629,9 +11738,9 @@
         </w:numPr>
         <w:spacing w:after="0"/>
         <w:rPr>
-          <w:ins w:id="204" w:author="Isabelle Gouttevin" w:date="2015-09-18T15:33:00Z"/>
+          <w:ins w:id="203" w:author="Isabelle Gouttevin" w:date="2015-09-18T15:33:00Z"/>
         </w:rPr>
-        <w:pPrChange w:id="205" w:author="Isabelle Gouttevin" w:date="2015-09-18T15:32:00Z">
+        <w:pPrChange w:id="204" w:author="Isabelle Gouttevin" w:date="2015-09-18T15:32:00Z">
           <w:pPr>
             <w:spacing w:after="0"/>
           </w:pPr>
@@ -11651,12 +11760,12 @@
       <w:r>
         <w:t xml:space="preserve"> </w:t>
       </w:r>
-      <w:del w:id="206" w:author="Isabelle Gouttevin" w:date="2015-09-18T15:36:00Z">
+      <w:del w:id="205" w:author="Isabelle Gouttevin" w:date="2015-09-18T15:36:00Z">
         <w:r>
           <w:delText>Selon le</w:delText>
         </w:r>
       </w:del>
-      <w:ins w:id="207" w:author="Isabelle Gouttevin" w:date="2015-09-18T15:36:00Z">
+      <w:ins w:id="206" w:author="Isabelle Gouttevin" w:date="2015-09-18T15:36:00Z">
         <w:r>
           <w:t>Afin de respecter les modalités d’application du</w:t>
         </w:r>
@@ -11664,12 +11773,12 @@
       <w:r>
         <w:t xml:space="preserve"> type d’irrigation choisi, l’eau </w:t>
       </w:r>
-      <w:del w:id="208" w:author="Isabelle Gouttevin" w:date="2015-09-18T15:35:00Z">
+      <w:del w:id="207" w:author="Isabelle Gouttevin" w:date="2015-09-18T15:35:00Z">
         <w:r>
           <w:delText>est ajoutée</w:delText>
         </w:r>
       </w:del>
-      <w:ins w:id="209" w:author="Isabelle Gouttevin" w:date="2015-09-18T15:35:00Z">
+      <w:ins w:id="208" w:author="Isabelle Gouttevin" w:date="2015-09-18T15:35:00Z">
         <w:r>
           <w:t>parvient</w:t>
         </w:r>
@@ -11677,7 +11786,7 @@
       <w:r>
         <w:t xml:space="preserve"> </w:t>
       </w:r>
-      <w:del w:id="210" w:author="Isabelle Gouttevin" w:date="2015-09-18T15:35:00Z">
+      <w:del w:id="209" w:author="Isabelle Gouttevin" w:date="2015-09-18T15:35:00Z">
         <w:r>
           <w:delText xml:space="preserve">à différentes </w:delText>
         </w:r>
@@ -11685,17 +11794,17 @@
           <w:delText>variables du modèle</w:delText>
         </w:r>
       </w:del>
-      <w:ins w:id="211" w:author="Isabelle Gouttevin" w:date="2015-09-18T15:35:00Z">
+      <w:ins w:id="210" w:author="Isabelle Gouttevin" w:date="2015-09-18T15:35:00Z">
         <w:r>
           <w:t>au sol de façon différente</w:t>
         </w:r>
       </w:ins>
-      <w:del w:id="212" w:author="Isabelle Gouttevin" w:date="2015-09-18T15:35:00Z">
+      <w:del w:id="211" w:author="Isabelle Gouttevin" w:date="2015-09-18T15:35:00Z">
         <w:r>
           <w:delText>.</w:delText>
         </w:r>
       </w:del>
-      <w:ins w:id="213" w:author="Isabelle Gouttevin" w:date="2015-09-18T15:35:00Z">
+      <w:ins w:id="212" w:author="Isabelle Gouttevin" w:date="2015-09-18T15:35:00Z">
         <w:r>
           <w:t> :</w:t>
         </w:r>
@@ -11711,7 +11820,7 @@
       <w:pPr>
         <w:pStyle w:val="Paragraphedeliste"/>
         <w:spacing w:after="0"/>
-        <w:pPrChange w:id="214" w:author="Isabelle Gouttevin" w:date="2015-09-18T15:33:00Z">
+        <w:pPrChange w:id="213" w:author="Isabelle Gouttevin" w:date="2015-09-18T15:33:00Z">
           <w:pPr>
             <w:spacing w:after="0"/>
           </w:pPr>
@@ -11722,11 +11831,11 @@
       <w:pPr>
         <w:pStyle w:val="Titre3"/>
       </w:pPr>
-      <w:bookmarkStart w:id="215" w:name="_Toc430166142"/>
+      <w:bookmarkStart w:id="214" w:name="_Toc430166142"/>
       <w:r>
         <w:t>Données disponibles et hypothèses retenues</w:t>
       </w:r>
-      <w:bookmarkEnd w:id="215"/>
+      <w:bookmarkEnd w:id="214"/>
     </w:p>
     <w:p>
       <w:pPr>
@@ -11841,7 +11950,7 @@
     <w:p>
       <w:pPr>
         <w:rPr>
-          <w:ins w:id="216" w:author="Isabelle Gouttevin" w:date="2015-09-18T15:46:00Z"/>
+          <w:ins w:id="215" w:author="Isabelle Gouttevin" w:date="2015-09-18T15:46:00Z"/>
         </w:rPr>
       </w:pPr>
       <w:r>
@@ -11850,10 +11959,7 @@
     </w:p>
     <w:p>
       <w:r>
-        <w:t>En revanche, n</w:t>
-      </w:r>
-      <w:r>
-        <w:t>ous mettrons en regard les résultats du module d’irrigation (diagnostique de la quantité d’eau requise pour l’irrigation) avec les prélèvements identifiés comme « à destination agricole » (81 et 82, et éventuellement 85) dans la base de données de l’Agence de l’Eau : cette comparaison nous permettra d’estimer la cohérence globale de notre approche, tout en gardant à l’esprit  la nature différente des données comparées (consommation vs prélèvement) et les incertitudes relatives à la donnée (usage  agricole seulement partiel de l’eau des canaux).</w:t>
+        <w:t>En revanche, nous mettrons en regard les résultats du module d’irrigation (diagnostique de la quantité d’eau requise pour l’irrigation) avec les prélèvements identifiés comme « à destination agricole » (81 et 82, et éventuellement 85) dans la base de données de l’Agence de l’Eau : cette comparaison nous permettra d’estimer la cohérence globale de notre approche, tout en gardant à l’esprit  la nature différente des données comparées (consommation vs prélèvement) et les incertitudes relatives à la donnée (usage  agricole seulement partiel de l’eau des canaux).</w:t>
       </w:r>
     </w:p>
     <w:p>
@@ -11862,63 +11968,76 @@
         <w:keepNext/>
         <w:jc w:val="left"/>
       </w:pPr>
-      <w:bookmarkStart w:id="217" w:name="_Ref430101650"/>
+      <w:bookmarkStart w:id="216" w:name="_Ref430101650"/>
       <w:r>
         <w:t xml:space="preserve">Tableau </w:t>
       </w:r>
-      <w:fldSimple w:instr=" SEQ Tableau \* ARABIC ">
-        <w:r>
-          <w:rPr>
-            <w:noProof/>
-          </w:rPr>
-          <w:t>2</w:t>
-        </w:r>
-      </w:fldSimple>
-      <w:bookmarkEnd w:id="217"/>
+      <w:r>
+        <w:fldChar w:fldCharType="begin"/>
+      </w:r>
+      <w:r>
+        <w:instrText xml:space="preserve"> SEQ Tableau \* ARABIC </w:instrText>
+      </w:r>
+      <w:r>
+        <w:fldChar w:fldCharType="separate"/>
+      </w:r>
+      <w:r>
+        <w:rPr>
+          <w:noProof/>
+        </w:rPr>
+        <w:t>2</w:t>
+      </w:r>
+      <w:r>
+        <w:rPr>
+          <w:noProof/>
+        </w:rPr>
+        <w:fldChar w:fldCharType="end"/>
+      </w:r>
+      <w:bookmarkEnd w:id="216"/>
       <w:r>
         <w:t xml:space="preserve"> : Agrégation des cultu</w:t>
       </w:r>
       <w:r>
         <w:t xml:space="preserve">res issues du RGA </w:t>
       </w:r>
+      <w:ins w:id="217" w:author="Isabelle Gouttevin" w:date="2015-09-18T15:44:00Z">
+        <w:r>
+          <w:t xml:space="preserve">par grand type de cultures, </w:t>
+        </w:r>
+      </w:ins>
+      <w:r>
+        <w:t>et proportion</w:t>
+      </w:r>
       <w:ins w:id="218" w:author="Isabelle Gouttevin" w:date="2015-09-18T15:44:00Z">
         <w:r>
-          <w:t xml:space="preserve">par grand type de cultures, </w:t>
+          <w:t xml:space="preserve"> de</w:t>
         </w:r>
       </w:ins>
       <w:r>
-        <w:t>et proportion</w:t>
-      </w:r>
-      <w:ins w:id="219" w:author="Isabelle Gouttevin" w:date="2015-09-18T15:44:00Z">
-        <w:r>
-          <w:t xml:space="preserve"> de</w:t>
+        <w:t xml:space="preserve"> </w:t>
+      </w:r>
+      <w:del w:id="219" w:author="Isabelle Gouttevin" w:date="2015-09-18T15:44:00Z">
+        <w:r>
+          <w:delText xml:space="preserve">sur </w:delText>
+        </w:r>
+      </w:del>
+      <w:r>
+        <w:t xml:space="preserve">la SAU irriguée </w:t>
+      </w:r>
+      <w:ins w:id="220" w:author="Isabelle Gouttevin" w:date="2015-09-18T15:45:00Z">
+        <w:r>
+          <w:t>de chaque grand type de culture sur le</w:t>
         </w:r>
       </w:ins>
-      <w:r>
-        <w:t xml:space="preserve"> </w:t>
-      </w:r>
-      <w:del w:id="220" w:author="Isabelle Gouttevin" w:date="2015-09-18T15:44:00Z">
-        <w:r>
-          <w:delText xml:space="preserve">sur </w:delText>
+      <w:del w:id="221" w:author="Isabelle Gouttevin" w:date="2015-09-18T15:45:00Z">
+        <w:r>
+          <w:delText>du</w:delText>
         </w:r>
       </w:del>
       <w:r>
-        <w:t xml:space="preserve">la SAU irriguée </w:t>
-      </w:r>
-      <w:ins w:id="221" w:author="Isabelle Gouttevin" w:date="2015-09-18T15:45:00Z">
-        <w:r>
-          <w:t>de chaque grand type de culture sur le</w:t>
-        </w:r>
-      </w:ins>
-      <w:del w:id="222" w:author="Isabelle Gouttevin" w:date="2015-09-18T15:45:00Z">
-        <w:r>
-          <w:delText>du</w:delText>
-        </w:r>
-      </w:del>
-      <w:r>
         <w:t xml:space="preserve"> bassin</w:t>
       </w:r>
-      <w:ins w:id="223" w:author="Isabelle Gouttevin" w:date="2015-09-18T15:45:00Z">
+      <w:ins w:id="222" w:author="Isabelle Gouttevin" w:date="2015-09-18T15:45:00Z">
         <w:r>
           <w:t xml:space="preserve"> du Rhône.</w:t>
         </w:r>
@@ -13682,7 +13801,7 @@
       <w:r>
         <w:t xml:space="preserve"> </w:t>
       </w:r>
-      <w:ins w:id="224" w:author="Isabelle Gouttevin" w:date="2015-09-18T15:49:00Z">
+      <w:ins w:id="223" w:author="Isabelle Gouttevin" w:date="2015-09-18T15:49:00Z">
         <w:r>
           <w:t>irriguée</w:t>
         </w:r>
@@ -13690,7 +13809,7 @@
       <w:r>
         <w:t xml:space="preserve"> dominante </w:t>
       </w:r>
-      <w:del w:id="225" w:author="Isabelle Gouttevin" w:date="2015-09-18T15:49:00Z">
+      <w:del w:id="224" w:author="Isabelle Gouttevin" w:date="2015-09-18T15:49:00Z">
         <w:r>
           <w:delText>sur la surface irriguée d’</w:delText>
         </w:r>
@@ -13698,7 +13817,7 @@
           <w:delText>un</w:delText>
         </w:r>
       </w:del>
-      <w:ins w:id="226" w:author="Isabelle Gouttevin" w:date="2015-09-18T15:49:00Z">
+      <w:ins w:id="225" w:author="Isabelle Gouttevin" w:date="2015-09-18T15:49:00Z">
         <w:r>
           <w:t>sur chaque</w:t>
         </w:r>
@@ -13788,19 +13907,32 @@
                                 <w:noProof/>
                               </w:rPr>
                             </w:pPr>
-                            <w:bookmarkStart w:id="227" w:name="_Ref430101288"/>
+                            <w:bookmarkStart w:id="226" w:name="_Ref430101288"/>
                             <w:r>
                               <w:t xml:space="preserve">Figure </w:t>
                             </w:r>
-                            <w:fldSimple w:instr=" SEQ Figure \* ARABIC ">
-                              <w:r>
-                                <w:rPr>
-                                  <w:noProof/>
-                                </w:rPr>
-                                <w:t>6</w:t>
-                              </w:r>
-                            </w:fldSimple>
-                            <w:bookmarkEnd w:id="227"/>
+                            <w:r>
+                              <w:fldChar w:fldCharType="begin"/>
+                            </w:r>
+                            <w:r>
+                              <w:instrText xml:space="preserve"> SEQ Figure \* ARABIC </w:instrText>
+                            </w:r>
+                            <w:r>
+                              <w:fldChar w:fldCharType="separate"/>
+                            </w:r>
+                            <w:r>
+                              <w:rPr>
+                                <w:noProof/>
+                              </w:rPr>
+                              <w:t>6</w:t>
+                            </w:r>
+                            <w:r>
+                              <w:rPr>
+                                <w:noProof/>
+                              </w:rPr>
+                              <w:fldChar w:fldCharType="end"/>
+                            </w:r>
+                            <w:bookmarkEnd w:id="226"/>
                             <w:r>
                               <w:t xml:space="preserve"> : Rapport </w:t>
                             </w:r>
@@ -13887,12 +14019,12 @@
                             <w:r>
                               <w:t xml:space="preserve"> sur les cantons du bassin du Rhône</w:t>
                             </w:r>
-                            <w:ins w:id="228" w:author="Isabelle Gouttevin" w:date="2015-09-18T15:50:00Z">
+                            <w:ins w:id="227" w:author="Isabelle Gouttevin" w:date="2015-09-18T15:50:00Z">
                               <w:r>
                                 <w:t xml:space="preserve">, et cantons identifiés comme </w:t>
                               </w:r>
                             </w:ins>
-                            <w:ins w:id="229" w:author="Isabelle Gouttevin" w:date="2015-09-18T15:51:00Z">
+                            <w:ins w:id="228" w:author="Isabelle Gouttevin" w:date="2015-09-18T15:51:00Z">
                               <w:r>
                                 <w:t>« irrigués » dans notre modélisation.</w:t>
                               </w:r>
@@ -13927,19 +14059,32 @@
                           <w:noProof/>
                         </w:rPr>
                       </w:pPr>
-                      <w:bookmarkStart w:id="230" w:name="_Ref430101288"/>
+                      <w:bookmarkStart w:id="229" w:name="_Ref430101288"/>
                       <w:r>
                         <w:t xml:space="preserve">Figure </w:t>
                       </w:r>
-                      <w:fldSimple w:instr=" SEQ Figure \* ARABIC ">
-                        <w:r>
-                          <w:rPr>
-                            <w:noProof/>
-                          </w:rPr>
-                          <w:t>6</w:t>
-                        </w:r>
-                      </w:fldSimple>
-                      <w:bookmarkEnd w:id="230"/>
+                      <w:r>
+                        <w:fldChar w:fldCharType="begin"/>
+                      </w:r>
+                      <w:r>
+                        <w:instrText xml:space="preserve"> SEQ Figure \* ARABIC </w:instrText>
+                      </w:r>
+                      <w:r>
+                        <w:fldChar w:fldCharType="separate"/>
+                      </w:r>
+                      <w:r>
+                        <w:rPr>
+                          <w:noProof/>
+                        </w:rPr>
+                        <w:t>6</w:t>
+                      </w:r>
+                      <w:r>
+                        <w:rPr>
+                          <w:noProof/>
+                        </w:rPr>
+                        <w:fldChar w:fldCharType="end"/>
+                      </w:r>
+                      <w:bookmarkEnd w:id="229"/>
                       <w:r>
                         <w:t xml:space="preserve"> : Rapport </w:t>
                       </w:r>
@@ -14026,12 +14171,12 @@
                       <w:r>
                         <w:t xml:space="preserve"> sur les cantons du bassin du Rhône</w:t>
                       </w:r>
-                      <w:ins w:id="231" w:author="Isabelle Gouttevin" w:date="2015-09-18T15:50:00Z">
+                      <w:ins w:id="230" w:author="Isabelle Gouttevin" w:date="2015-09-18T15:50:00Z">
                         <w:r>
                           <w:t xml:space="preserve">, et cantons identifiés comme </w:t>
                         </w:r>
                       </w:ins>
-                      <w:ins w:id="232" w:author="Isabelle Gouttevin" w:date="2015-09-18T15:51:00Z">
+                      <w:ins w:id="231" w:author="Isabelle Gouttevin" w:date="2015-09-18T15:51:00Z">
                         <w:r>
                           <w:t>« irrigués » dans notre modélisation.</w:t>
                         </w:r>
@@ -14095,23 +14240,36 @@
                                 <w:noProof/>
                               </w:rPr>
                             </w:pPr>
-                            <w:bookmarkStart w:id="233" w:name="_Ref430101262"/>
+                            <w:bookmarkStart w:id="232" w:name="_Ref430101262"/>
                             <w:r>
                               <w:t xml:space="preserve">Figure </w:t>
                             </w:r>
-                            <w:fldSimple w:instr=" SEQ Figure \* ARABIC ">
-                              <w:r>
-                                <w:rPr>
-                                  <w:noProof/>
-                                </w:rPr>
-                                <w:t>5</w:t>
-                              </w:r>
-                            </w:fldSimple>
-                            <w:bookmarkEnd w:id="233"/>
+                            <w:r>
+                              <w:fldChar w:fldCharType="begin"/>
+                            </w:r>
+                            <w:r>
+                              <w:instrText xml:space="preserve"> SEQ Figure \* ARABIC </w:instrText>
+                            </w:r>
+                            <w:r>
+                              <w:fldChar w:fldCharType="separate"/>
+                            </w:r>
+                            <w:r>
+                              <w:rPr>
+                                <w:noProof/>
+                              </w:rPr>
+                              <w:t>5</w:t>
+                            </w:r>
+                            <w:r>
+                              <w:rPr>
+                                <w:noProof/>
+                              </w:rPr>
+                              <w:fldChar w:fldCharType="end"/>
+                            </w:r>
+                            <w:bookmarkEnd w:id="232"/>
                             <w:r>
                               <w:t xml:space="preserve"> : Culture</w:t>
                             </w:r>
-                            <w:ins w:id="234" w:author="Isabelle Gouttevin" w:date="2015-09-18T15:51:00Z">
+                            <w:ins w:id="233" w:author="Isabelle Gouttevin" w:date="2015-09-18T15:51:00Z">
                               <w:r>
                                 <w:t xml:space="preserve"> irriguée</w:t>
                               </w:r>
@@ -14119,7 +14277,7 @@
                             <w:r>
                               <w:t xml:space="preserve"> dominante par canton </w:t>
                             </w:r>
-                            <w:del w:id="235" w:author="Isabelle Gouttevin" w:date="2015-09-18T15:51:00Z">
+                            <w:del w:id="234" w:author="Isabelle Gouttevin" w:date="2015-09-18T15:51:00Z">
                               <w:r>
                                 <w:delText>sur la SAU irriguée</w:delText>
                               </w:r>
@@ -14154,23 +14312,36 @@
                           <w:noProof/>
                         </w:rPr>
                       </w:pPr>
-                      <w:bookmarkStart w:id="236" w:name="_Ref430101262"/>
+                      <w:bookmarkStart w:id="235" w:name="_Ref430101262"/>
                       <w:r>
                         <w:t xml:space="preserve">Figure </w:t>
                       </w:r>
-                      <w:fldSimple w:instr=" SEQ Figure \* ARABIC ">
-                        <w:r>
-                          <w:rPr>
-                            <w:noProof/>
-                          </w:rPr>
-                          <w:t>5</w:t>
-                        </w:r>
-                      </w:fldSimple>
-                      <w:bookmarkEnd w:id="236"/>
+                      <w:r>
+                        <w:fldChar w:fldCharType="begin"/>
+                      </w:r>
+                      <w:r>
+                        <w:instrText xml:space="preserve"> SEQ Figure \* ARABIC </w:instrText>
+                      </w:r>
+                      <w:r>
+                        <w:fldChar w:fldCharType="separate"/>
+                      </w:r>
+                      <w:r>
+                        <w:rPr>
+                          <w:noProof/>
+                        </w:rPr>
+                        <w:t>5</w:t>
+                      </w:r>
+                      <w:r>
+                        <w:rPr>
+                          <w:noProof/>
+                        </w:rPr>
+                        <w:fldChar w:fldCharType="end"/>
+                      </w:r>
+                      <w:bookmarkEnd w:id="235"/>
                       <w:r>
                         <w:t xml:space="preserve"> : Culture</w:t>
                       </w:r>
-                      <w:ins w:id="237" w:author="Isabelle Gouttevin" w:date="2015-09-18T15:51:00Z">
+                      <w:ins w:id="236" w:author="Isabelle Gouttevin" w:date="2015-09-18T15:51:00Z">
                         <w:r>
                           <w:t xml:space="preserve"> irriguée</w:t>
                         </w:r>
@@ -14178,7 +14349,7 @@
                       <w:r>
                         <w:t xml:space="preserve"> dominante par canton </w:t>
                       </w:r>
-                      <w:del w:id="238" w:author="Isabelle Gouttevin" w:date="2015-09-18T15:51:00Z">
+                      <w:del w:id="237" w:author="Isabelle Gouttevin" w:date="2015-09-18T15:51:00Z">
                         <w:r>
                           <w:delText>sur la SAU irriguée</w:delText>
                         </w:r>
@@ -14200,28 +14371,25 @@
       <w:r>
         <w:t xml:space="preserve">Sur les 573 cantons du bassin versant du Rhône à Beaucaire, nous avons </w:t>
       </w:r>
-      <w:del w:id="239" w:author="Isabelle Gouttevin" w:date="2015-09-18T15:52:00Z">
+      <w:del w:id="238" w:author="Isabelle Gouttevin" w:date="2015-09-18T15:52:00Z">
         <w:r>
           <w:delText xml:space="preserve">identifié </w:delText>
         </w:r>
       </w:del>
-      <w:ins w:id="240" w:author="Isabelle Gouttevin" w:date="2015-09-18T15:52:00Z">
-        <w:r>
-          <w:t>caractérisé</w:t>
-        </w:r>
-        <w:r>
-          <w:t xml:space="preserve"> </w:t>
+      <w:ins w:id="239" w:author="Isabelle Gouttevin" w:date="2015-09-18T15:52:00Z">
+        <w:r>
+          <w:t xml:space="preserve">caractérisé </w:t>
         </w:r>
       </w:ins>
       <w:r>
         <w:t xml:space="preserve">les cantons irrigués </w:t>
       </w:r>
-      <w:del w:id="241" w:author="Isabelle Gouttevin" w:date="2015-09-18T15:52:00Z">
+      <w:del w:id="240" w:author="Isabelle Gouttevin" w:date="2015-09-18T15:52:00Z">
         <w:r>
           <w:delText>à partir du</w:delText>
         </w:r>
       </w:del>
-      <w:ins w:id="242" w:author="Isabelle Gouttevin" w:date="2015-09-18T15:52:00Z">
+      <w:ins w:id="241" w:author="Isabelle Gouttevin" w:date="2015-09-18T15:52:00Z">
         <w:r>
           <w:t>par le</w:t>
         </w:r>
@@ -14314,7 +14482,7 @@
       <w:r>
         <w:t>a</w:t>
       </w:r>
-      <w:ins w:id="243" w:author="Isabelle Gouttevin" w:date="2015-09-18T15:52:00Z">
+      <w:ins w:id="242" w:author="Isabelle Gouttevin" w:date="2015-09-18T15:52:00Z">
         <w:r>
           <w:t xml:space="preserve"> ainsi</w:t>
         </w:r>
@@ -14333,6 +14501,15 @@
       </w:r>
       <w:r>
         <w:t xml:space="preserve"> </w:t>
+      </w:r>
+      <w:r>
+        <w:rPr>
+          <w:b/>
+          <w:rPrChange w:id="243" w:author="Isabelle Gouttevin" w:date="2015-09-18T15:53:00Z">
+            <w:rPr/>
+          </w:rPrChange>
+        </w:rPr>
+        <w:t>soit</w:t>
       </w:r>
       <w:r>
         <w:rPr>
@@ -14341,15 +14518,6 @@
             <w:rPr/>
           </w:rPrChange>
         </w:rPr>
-        <w:t>soit</w:t>
-      </w:r>
-      <w:r>
-        <w:rPr>
-          <w:b/>
-          <w:rPrChange w:id="245" w:author="Isabelle Gouttevin" w:date="2015-09-18T15:53:00Z">
-            <w:rPr/>
-          </w:rPrChange>
-        </w:rPr>
         <w:t xml:space="preserve"> 173 cantons irrigués sur le bassin versant du Rhône</w:t>
       </w:r>
       <w:r>
@@ -14382,14 +14550,14 @@
       <w:r>
         <w:t xml:space="preserve">. </w:t>
       </w:r>
-      <w:ins w:id="246" w:author="Isabelle Gouttevin" w:date="2015-09-18T15:53:00Z">
+      <w:ins w:id="245" w:author="Isabelle Gouttevin" w:date="2015-09-18T15:53:00Z">
         <w:r>
           <w:t xml:space="preserve">Ces surfaces respectent globalement les contours des zones à forts prélèvements agricoles recensés par la base de données de prélèvements de l’Agence de l’Eau </w:t>
         </w:r>
         <w:r>
           <w:rPr>
             <w:highlight w:val="green"/>
-            <w:rPrChange w:id="247" w:author="Isabelle Gouttevin" w:date="2015-09-18T15:54:00Z">
+            <w:rPrChange w:id="246" w:author="Isabelle Gouttevin" w:date="2015-09-18T15:54:00Z">
               <w:rPr/>
             </w:rPrChange>
           </w:rPr>
@@ -14699,19 +14867,32 @@
                                 <w:noProof/>
                               </w:rPr>
                             </w:pPr>
-                            <w:bookmarkStart w:id="248" w:name="_Ref430101067"/>
+                            <w:bookmarkStart w:id="247" w:name="_Ref430101067"/>
                             <w:r>
                               <w:t xml:space="preserve">Figure </w:t>
                             </w:r>
-                            <w:fldSimple w:instr=" SEQ Figure \* ARABIC ">
-                              <w:r>
-                                <w:rPr>
-                                  <w:noProof/>
-                                </w:rPr>
-                                <w:t>7</w:t>
-                              </w:r>
-                            </w:fldSimple>
-                            <w:bookmarkEnd w:id="248"/>
+                            <w:r>
+                              <w:fldChar w:fldCharType="begin"/>
+                            </w:r>
+                            <w:r>
+                              <w:instrText xml:space="preserve"> SEQ Figure \* ARABIC </w:instrText>
+                            </w:r>
+                            <w:r>
+                              <w:fldChar w:fldCharType="separate"/>
+                            </w:r>
+                            <w:r>
+                              <w:rPr>
+                                <w:noProof/>
+                              </w:rPr>
+                              <w:t>7</w:t>
+                            </w:r>
+                            <w:r>
+                              <w:rPr>
+                                <w:noProof/>
+                              </w:rPr>
+                              <w:fldChar w:fldCharType="end"/>
+                            </w:r>
+                            <w:bookmarkEnd w:id="247"/>
                             <w:r>
                               <w:t xml:space="preserve"> : HRUs irriguées et leurs cultures dominantes sur le bassin du Rhône</w:t>
                             </w:r>
@@ -14742,19 +14923,32 @@
                           <w:noProof/>
                         </w:rPr>
                       </w:pPr>
-                      <w:bookmarkStart w:id="249" w:name="_Ref430101067"/>
+                      <w:bookmarkStart w:id="248" w:name="_Ref430101067"/>
                       <w:r>
                         <w:t xml:space="preserve">Figure </w:t>
                       </w:r>
-                      <w:fldSimple w:instr=" SEQ Figure \* ARABIC ">
-                        <w:r>
-                          <w:rPr>
-                            <w:noProof/>
-                          </w:rPr>
-                          <w:t>7</w:t>
-                        </w:r>
-                      </w:fldSimple>
-                      <w:bookmarkEnd w:id="249"/>
+                      <w:r>
+                        <w:fldChar w:fldCharType="begin"/>
+                      </w:r>
+                      <w:r>
+                        <w:instrText xml:space="preserve"> SEQ Figure \* ARABIC </w:instrText>
+                      </w:r>
+                      <w:r>
+                        <w:fldChar w:fldCharType="separate"/>
+                      </w:r>
+                      <w:r>
+                        <w:rPr>
+                          <w:noProof/>
+                        </w:rPr>
+                        <w:t>7</w:t>
+                      </w:r>
+                      <w:r>
+                        <w:rPr>
+                          <w:noProof/>
+                        </w:rPr>
+                        <w:fldChar w:fldCharType="end"/>
+                      </w:r>
+                      <w:bookmarkEnd w:id="248"/>
                       <w:r>
                         <w:t xml:space="preserve"> : HRUs irriguées et leurs cultures dominantes sur le bassin du Rhône</w:t>
                       </w:r>
@@ -14820,12 +15014,12 @@
       <w:r>
         <w:t>Au contraire, d’autres cantons considérés comme irrigués ne présentent aucune HRU irriguée. Une analyse de ces cantons montrent qu’ils sont principalement occupés par de la forêt sur le département du Gard et de la forêt et des roches sur le Verdon amont et l’Arc amont</w:t>
       </w:r>
-      <w:ins w:id="250" w:author="Isabelle Gouttevin" w:date="2015-09-18T15:55:00Z">
+      <w:ins w:id="249" w:author="Isabelle Gouttevin" w:date="2015-09-18T15:55:00Z">
         <w:r>
           <w:t>, ce qui n’exclut pas la présence de parcelles d</w:t>
         </w:r>
       </w:ins>
-      <w:ins w:id="251" w:author="Isabelle Gouttevin" w:date="2015-09-18T15:56:00Z">
+      <w:ins w:id="250" w:author="Isabelle Gouttevin" w:date="2015-09-18T15:56:00Z">
         <w:r>
           <w:t>’agriculture à des échelles plus fines que celle de notre maillage</w:t>
         </w:r>
@@ -14835,12 +15029,12 @@
       </w:r>
     </w:p>
     <w:p>
-      <w:commentRangeStart w:id="252"/>
+      <w:commentRangeStart w:id="251"/>
       <w:r>
         <w:t>Nous remarquons également que les cantons irrigués retenus ne sont pas représentatifs de la variété des cultures sur le bassin du Rhône</w:t>
       </w:r>
-      <w:commentRangeEnd w:id="252"/>
-      <w:ins w:id="253" w:author="Isabelle Gouttevin" w:date="2015-09-18T16:03:00Z">
+      <w:commentRangeEnd w:id="251"/>
+      <w:ins w:id="252" w:author="Isabelle Gouttevin" w:date="2015-09-18T16:03:00Z">
         <w:r>
           <w:t xml:space="preserve">, mais en représentent les principales lignes (Maraichage dans la </w:t>
         </w:r>
@@ -14849,7 +15043,7 @@
           <w:t>Sa</w:t>
         </w:r>
       </w:ins>
-      <w:ins w:id="254" w:author="Isabelle Gouttevin" w:date="2015-09-18T16:04:00Z">
+      <w:ins w:id="253" w:author="Isabelle Gouttevin" w:date="2015-09-18T16:04:00Z">
         <w:r>
           <w:t>one</w:t>
         </w:r>
@@ -14858,42 +15052,42 @@
           <w:t>, grandes cultures</w:t>
         </w:r>
       </w:ins>
-      <w:ins w:id="255" w:author="Isabelle Gouttevin" w:date="2015-09-18T16:05:00Z">
+      <w:ins w:id="254" w:author="Isabelle Gouttevin" w:date="2015-09-18T16:05:00Z">
         <w:r>
           <w:t>, maraichage</w:t>
         </w:r>
       </w:ins>
-      <w:ins w:id="256" w:author="Isabelle Gouttevin" w:date="2015-09-18T16:04:00Z">
+      <w:ins w:id="255" w:author="Isabelle Gouttevin" w:date="2015-09-18T16:04:00Z">
         <w:r>
           <w:t xml:space="preserve"> et </w:t>
         </w:r>
       </w:ins>
-      <w:ins w:id="257" w:author="Isabelle Gouttevin" w:date="2015-09-18T16:05:00Z">
+      <w:ins w:id="256" w:author="Isabelle Gouttevin" w:date="2015-09-18T16:05:00Z">
         <w:r>
           <w:t>vergers</w:t>
         </w:r>
       </w:ins>
-      <w:ins w:id="258" w:author="Isabelle Gouttevin" w:date="2015-09-18T16:04:00Z">
+      <w:ins w:id="257" w:author="Isabelle Gouttevin" w:date="2015-09-18T16:04:00Z">
         <w:r>
           <w:t xml:space="preserve"> </w:t>
         </w:r>
       </w:ins>
-      <w:ins w:id="259" w:author="Isabelle Gouttevin" w:date="2015-09-18T16:05:00Z">
+      <w:ins w:id="258" w:author="Isabelle Gouttevin" w:date="2015-09-18T16:05:00Z">
         <w:r>
           <w:t>d</w:t>
         </w:r>
       </w:ins>
-      <w:ins w:id="260" w:author="Isabelle Gouttevin" w:date="2015-09-18T16:04:00Z">
+      <w:ins w:id="259" w:author="Isabelle Gouttevin" w:date="2015-09-18T16:04:00Z">
         <w:r>
           <w:t xml:space="preserve">e vallée du </w:t>
         </w:r>
       </w:ins>
-      <w:ins w:id="261" w:author="Isabelle Gouttevin" w:date="2015-09-18T16:05:00Z">
+      <w:ins w:id="260" w:author="Isabelle Gouttevin" w:date="2015-09-18T16:05:00Z">
         <w:r>
           <w:t>Rhône</w:t>
         </w:r>
       </w:ins>
-      <w:ins w:id="262" w:author="Isabelle Gouttevin" w:date="2015-09-18T16:04:00Z">
+      <w:ins w:id="261" w:author="Isabelle Gouttevin" w:date="2015-09-18T16:04:00Z">
         <w:r>
           <w:t xml:space="preserve">, prairies des Alpes du Sud et </w:t>
         </w:r>
@@ -14904,7 +15098,7 @@
           <w:t>néen</w:t>
         </w:r>
       </w:ins>
-      <w:ins w:id="263" w:author="Isabelle Gouttevin" w:date="2015-09-18T16:05:00Z">
+      <w:ins w:id="262" w:author="Isabelle Gouttevin" w:date="2015-09-18T16:05:00Z">
         <w:r>
           <w:t>)</w:t>
         </w:r>
@@ -14913,7 +15107,7 @@
         <w:rPr>
           <w:rStyle w:val="Marquedecommentaire"/>
         </w:rPr>
-        <w:commentReference w:id="252"/>
+        <w:commentReference w:id="251"/>
       </w:r>
       <w:r>
         <w:t>.</w:t>
@@ -14923,6 +15117,13 @@
     <w:p>
       <w:pPr>
         <w:rPr>
+          <w:del w:id="263" w:author="Isabelle Gouttevin" w:date="2015-09-18T16:05:00Z"/>
+        </w:rPr>
+      </w:pPr>
+    </w:p>
+    <w:p>
+      <w:pPr>
+        <w:rPr>
           <w:del w:id="264" w:author="Isabelle Gouttevin" w:date="2015-09-18T16:05:00Z"/>
         </w:rPr>
       </w:pPr>
@@ -14936,32 +15137,36 @@
     </w:p>
     <w:p>
       <w:pPr>
-        <w:rPr>
-          <w:del w:id="266" w:author="Isabelle Gouttevin" w:date="2015-09-18T16:05:00Z"/>
-        </w:rPr>
-      </w:pPr>
-    </w:p>
-    <w:p>
-      <w:pPr>
         <w:pStyle w:val="Lgende"/>
         <w:keepNext/>
         <w:jc w:val="left"/>
       </w:pPr>
-      <w:bookmarkStart w:id="267" w:name="_Ref430100914"/>
-      <w:bookmarkStart w:id="268" w:name="_GoBack"/>
-      <w:bookmarkEnd w:id="268"/>
+      <w:bookmarkStart w:id="266" w:name="_Ref430100914"/>
       <w:r>
         <w:t xml:space="preserve">Tableau </w:t>
       </w:r>
-      <w:fldSimple w:instr=" SEQ Tableau \* ARABIC ">
-        <w:r>
-          <w:rPr>
-            <w:noProof/>
-          </w:rPr>
-          <w:t>3</w:t>
-        </w:r>
-      </w:fldSimple>
-      <w:bookmarkEnd w:id="267"/>
+      <w:r>
+        <w:fldChar w:fldCharType="begin"/>
+      </w:r>
+      <w:r>
+        <w:instrText xml:space="preserve"> SEQ Tableau \* ARABIC </w:instrText>
+      </w:r>
+      <w:r>
+        <w:fldChar w:fldCharType="separate"/>
+      </w:r>
+      <w:r>
+        <w:rPr>
+          <w:noProof/>
+        </w:rPr>
+        <w:t>3</w:t>
+      </w:r>
+      <w:r>
+        <w:rPr>
+          <w:noProof/>
+        </w:rPr>
+        <w:fldChar w:fldCharType="end"/>
+      </w:r>
+      <w:bookmarkEnd w:id="266"/>
       <w:r>
         <w:t xml:space="preserve"> : </w:t>
       </w:r>
@@ -17291,24 +17496,37 @@
                                 <w:noProof/>
                               </w:rPr>
                             </w:pPr>
-                            <w:bookmarkStart w:id="269" w:name="_Ref430100887"/>
-                            <w:bookmarkStart w:id="270" w:name="_Ref430100851"/>
+                            <w:bookmarkStart w:id="267" w:name="_Ref430100887"/>
+                            <w:bookmarkStart w:id="268" w:name="_Ref430100851"/>
                             <w:r>
                               <w:t xml:space="preserve">Figure </w:t>
                             </w:r>
-                            <w:fldSimple w:instr=" SEQ Figure \* ARABIC ">
-                              <w:r>
-                                <w:rPr>
-                                  <w:noProof/>
-                                </w:rPr>
-                                <w:t>8</w:t>
-                              </w:r>
-                            </w:fldSimple>
-                            <w:bookmarkEnd w:id="269"/>
+                            <w:r>
+                              <w:fldChar w:fldCharType="begin"/>
+                            </w:r>
+                            <w:r>
+                              <w:instrText xml:space="preserve"> SEQ Figure \* ARABIC </w:instrText>
+                            </w:r>
+                            <w:r>
+                              <w:fldChar w:fldCharType="separate"/>
+                            </w:r>
+                            <w:r>
+                              <w:rPr>
+                                <w:noProof/>
+                              </w:rPr>
+                              <w:t>8</w:t>
+                            </w:r>
+                            <w:r>
+                              <w:rPr>
+                                <w:noProof/>
+                              </w:rPr>
+                              <w:fldChar w:fldCharType="end"/>
+                            </w:r>
+                            <w:bookmarkEnd w:id="267"/>
                             <w:r>
                               <w:t xml:space="preserve"> : Evolution mensuelle du LAI pour les grands types de cultures retenus sur le bassin du Rhône</w:t>
                             </w:r>
-                            <w:bookmarkEnd w:id="270"/>
+                            <w:bookmarkEnd w:id="268"/>
                           </w:p>
                         </w:txbxContent>
                       </wps:txbx>
@@ -17339,24 +17557,37 @@
                           <w:noProof/>
                         </w:rPr>
                       </w:pPr>
-                      <w:bookmarkStart w:id="271" w:name="_Ref430100887"/>
-                      <w:bookmarkStart w:id="272" w:name="_Ref430100851"/>
+                      <w:bookmarkStart w:id="269" w:name="_Ref430100887"/>
+                      <w:bookmarkStart w:id="270" w:name="_Ref430100851"/>
                       <w:r>
                         <w:t xml:space="preserve">Figure </w:t>
                       </w:r>
-                      <w:fldSimple w:instr=" SEQ Figure \* ARABIC ">
-                        <w:r>
-                          <w:rPr>
-                            <w:noProof/>
-                          </w:rPr>
-                          <w:t>8</w:t>
-                        </w:r>
-                      </w:fldSimple>
-                      <w:bookmarkEnd w:id="271"/>
+                      <w:r>
+                        <w:fldChar w:fldCharType="begin"/>
+                      </w:r>
+                      <w:r>
+                        <w:instrText xml:space="preserve"> SEQ Figure \* ARABIC </w:instrText>
+                      </w:r>
+                      <w:r>
+                        <w:fldChar w:fldCharType="separate"/>
+                      </w:r>
+                      <w:r>
+                        <w:rPr>
+                          <w:noProof/>
+                        </w:rPr>
+                        <w:t>8</w:t>
+                      </w:r>
+                      <w:r>
+                        <w:rPr>
+                          <w:noProof/>
+                        </w:rPr>
+                        <w:fldChar w:fldCharType="end"/>
+                      </w:r>
+                      <w:bookmarkEnd w:id="269"/>
                       <w:r>
                         <w:t xml:space="preserve"> : Evolution mensuelle du LAI pour les grands types de cultures retenus sur le bassin du Rhône</w:t>
                       </w:r>
-                      <w:bookmarkEnd w:id="272"/>
+                      <w:bookmarkEnd w:id="270"/>
                     </w:p>
                   </w:txbxContent>
                 </v:textbox>
@@ -17381,21 +17612,21 @@
       <w:pPr>
         <w:pStyle w:val="Titre3"/>
       </w:pPr>
-      <w:bookmarkStart w:id="273" w:name="_Toc430166143"/>
+      <w:bookmarkStart w:id="271" w:name="_Toc430166143"/>
       <w:r>
         <w:t>Premiers tests</w:t>
       </w:r>
-      <w:bookmarkEnd w:id="273"/>
+      <w:bookmarkEnd w:id="271"/>
     </w:p>
     <w:p>
       <w:pPr>
         <w:pStyle w:val="Titre3"/>
       </w:pPr>
-      <w:bookmarkStart w:id="274" w:name="_Toc430166144"/>
+      <w:bookmarkStart w:id="272" w:name="_Toc430166144"/>
       <w:r>
         <w:t>Comparaison aux volumes prélevés</w:t>
       </w:r>
-      <w:bookmarkEnd w:id="274"/>
+      <w:bookmarkEnd w:id="272"/>
     </w:p>
     <w:p/>
     <w:p/>
@@ -17404,7 +17635,7 @@
       <w:pPr>
         <w:pStyle w:val="Titre2"/>
       </w:pPr>
-      <w:bookmarkStart w:id="275" w:name="_Toc430166145"/>
+      <w:bookmarkStart w:id="273" w:name="_Toc430166145"/>
       <w:r>
         <w:lastRenderedPageBreak/>
         <w:t xml:space="preserve">Impact anthropique 3 : </w:t>
@@ -17413,7 +17644,28 @@
         <w:t>AEP</w:t>
       </w:r>
       <w:r>
-        <w:t xml:space="preserve"> (Dorian)</w:t>
+        <w:t xml:space="preserve"> (Dorian</w:t>
+      </w:r>
+      <w:r>
+        <w:t>, Marielle</w:t>
+      </w:r>
+      <w:bookmarkStart w:id="274" w:name="_GoBack"/>
+      <w:bookmarkEnd w:id="274"/>
+      <w:r>
+        <w:t>)</w:t>
+      </w:r>
+      <w:bookmarkEnd w:id="273"/>
+    </w:p>
+    <w:p>
+      <w:pPr>
+        <w:pStyle w:val="Titre1"/>
+      </w:pPr>
+      <w:bookmarkStart w:id="275" w:name="_Toc430166146"/>
+      <w:r>
+        <w:t>Maillage du modèle : les améliorations techniques et ergonomiques</w:t>
+      </w:r>
+      <w:r>
+        <w:t xml:space="preserve"> (Christine)</w:t>
       </w:r>
       <w:bookmarkEnd w:id="275"/>
     </w:p>
@@ -17421,36 +17673,37 @@
       <w:pPr>
         <w:pStyle w:val="Titre1"/>
       </w:pPr>
-      <w:bookmarkStart w:id="276" w:name="_Toc430166146"/>
-      <w:r>
-        <w:t>Maillage du modèle : les améliorations techniques et ergonomiques</w:t>
-      </w:r>
-      <w:r>
-        <w:t xml:space="preserve"> (Christine)</w:t>
+      <w:bookmarkStart w:id="276" w:name="_Toc430166147"/>
+      <w:r>
+        <w:t xml:space="preserve">Scénarios prospectifs sur le bassin du </w:t>
+      </w:r>
+      <w:proofErr w:type="spellStart"/>
+      <w:r>
+        <w:t>Rhone</w:t>
+      </w:r>
+      <w:proofErr w:type="spellEnd"/>
+      <w:r>
+        <w:t xml:space="preserve"> (Amina, IG, JPV</w:t>
+      </w:r>
+      <w:r>
+        <w:t>, ES</w:t>
+      </w:r>
+      <w:r>
+        <w:t>)</w:t>
       </w:r>
       <w:bookmarkEnd w:id="276"/>
     </w:p>
     <w:p>
       <w:pPr>
         <w:pStyle w:val="Titre1"/>
-      </w:pPr>
-      <w:bookmarkStart w:id="277" w:name="_Toc430166147"/>
-      <w:r>
-        <w:t xml:space="preserve">Scénarios prospectifs sur le bassin du </w:t>
-      </w:r>
-      <w:proofErr w:type="spellStart"/>
-      <w:r>
-        <w:t>Rhone</w:t>
-      </w:r>
-      <w:proofErr w:type="spellEnd"/>
-      <w:r>
-        <w:t xml:space="preserve"> (Amina, IG, JPV</w:t>
-      </w:r>
-      <w:r>
-        <w:t>, ES</w:t>
-      </w:r>
-      <w:r>
-        <w:t>)</w:t>
+        <w:numPr>
+          <w:ilvl w:val="0"/>
+          <w:numId w:val="10"/>
+        </w:numPr>
+      </w:pPr>
+      <w:bookmarkStart w:id="277" w:name="_Toc430182449"/>
+      <w:r>
+        <w:t>Vers une modélisation intégrée pluie et hydrologie (EL)</w:t>
       </w:r>
       <w:bookmarkEnd w:id="277"/>
     </w:p>
@@ -17809,14 +18062,27 @@
       <w:r>
         <w:t xml:space="preserve"> </w:t>
       </w:r>
-      <w:fldSimple w:instr=" SEQ Figure \* ARABIC ">
-        <w:r>
-          <w:rPr>
-            <w:noProof/>
-          </w:rPr>
-          <w:t>9</w:t>
-        </w:r>
-      </w:fldSimple>
+      <w:r>
+        <w:fldChar w:fldCharType="begin"/>
+      </w:r>
+      <w:r>
+        <w:instrText xml:space="preserve"> SEQ Figure \* ARABIC </w:instrText>
+      </w:r>
+      <w:r>
+        <w:fldChar w:fldCharType="separate"/>
+      </w:r>
+      <w:r>
+        <w:rPr>
+          <w:noProof/>
+        </w:rPr>
+        <w:t>9</w:t>
+      </w:r>
+      <w:r>
+        <w:rPr>
+          <w:noProof/>
+        </w:rPr>
+        <w:fldChar w:fldCharType="end"/>
+      </w:r>
       <w:r>
         <w:t> : Positionnement des stations hydrométriques retenues pour deux précédentes études</w:t>
       </w:r>
@@ -18152,14 +18418,27 @@
       <w:r>
         <w:t xml:space="preserve">Tableau </w:t>
       </w:r>
-      <w:fldSimple w:instr=" SEQ Tableau \* ARABIC ">
-        <w:r>
-          <w:rPr>
-            <w:noProof/>
-          </w:rPr>
-          <w:t>4</w:t>
-        </w:r>
-      </w:fldSimple>
+      <w:r>
+        <w:fldChar w:fldCharType="begin"/>
+      </w:r>
+      <w:r>
+        <w:instrText xml:space="preserve"> SEQ Tableau \* ARABIC </w:instrText>
+      </w:r>
+      <w:r>
+        <w:fldChar w:fldCharType="separate"/>
+      </w:r>
+      <w:r>
+        <w:rPr>
+          <w:noProof/>
+        </w:rPr>
+        <w:t>4</w:t>
+      </w:r>
+      <w:r>
+        <w:rPr>
+          <w:noProof/>
+        </w:rPr>
+        <w:fldChar w:fldCharType="end"/>
+      </w:r>
       <w:bookmarkEnd w:id="303"/>
       <w:r>
         <w:t> :</w:t>
@@ -18365,7 +18644,7 @@
       </w:r>
     </w:p>
   </w:comment>
-  <w:comment w:id="97" w:author="Isabelle Gouttevin" w:date="2015-09-18T15:38:00Z" w:initials="IG">
+  <w:comment w:id="111" w:author="Isabelle Gouttevin" w:date="2015-09-18T15:39:00Z" w:initials="IG">
     <w:p>
       <w:pPr>
         <w:pStyle w:val="Commentaire"/>
@@ -18377,7 +18656,25 @@
         <w:annotationRef/>
       </w:r>
       <w:r>
-        <w:t xml:space="preserve">Je pense qu’il faudra </w:t>
+        <w:t>Je pense qu’il faut clairement distinguer le BESOIN en EAU (qui dépend de la culture</w:t>
+      </w:r>
+      <w:r>
+        <w:t xml:space="preserve"> et de son stress</w:t>
+      </w:r>
+      <w:r>
+        <w:t>) de l’APPORT EFFECTIF</w:t>
+      </w:r>
+      <w:r>
+        <w:t xml:space="preserve"> que tu appelles DOSE D’IRRIGATION</w:t>
+      </w:r>
+      <w:r>
+        <w:t xml:space="preserve"> ou DEMANDE</w:t>
+      </w:r>
+      <w:r>
+        <w:t xml:space="preserve"> (qui dépend du besoin en eau ET du type d’irrigation</w:t>
+      </w:r>
+      <w:r>
+        <w:t>)</w:t>
       </w:r>
     </w:p>
     <w:p>
@@ -18385,54 +18682,12 @@
         <w:pStyle w:val="Commentaire"/>
       </w:pPr>
     </w:p>
-  </w:comment>
-  <w:comment w:id="112" w:author="Isabelle Gouttevin" w:date="2015-09-18T15:39:00Z" w:initials="IG">
     <w:p>
       <w:pPr>
         <w:pStyle w:val="Commentaire"/>
       </w:pPr>
       <w:r>
-        <w:rPr>
-          <w:rStyle w:val="Marquedecommentaire"/>
-        </w:rPr>
-        <w:annotationRef/>
-      </w:r>
-      <w:r>
-        <w:t>Je pense qu’il faut clairement distinguer le BESOIN en EAU (qui dépend de la culture</w:t>
-      </w:r>
-      <w:r>
-        <w:t xml:space="preserve"> et de son stress</w:t>
-      </w:r>
-      <w:r>
-        <w:t>) de l’APPORT EFFECTIF</w:t>
-      </w:r>
-      <w:r>
-        <w:t xml:space="preserve"> que tu appelles DOSE D’IRRIGATION</w:t>
-      </w:r>
-      <w:r>
-        <w:t xml:space="preserve"> ou DEMANDE</w:t>
-      </w:r>
-      <w:r>
-        <w:t xml:space="preserve"> (qui dépend du besoin en eau ET du type d’irrigation</w:t>
-      </w:r>
-      <w:r>
-        <w:t>)</w:t>
-      </w:r>
-    </w:p>
-    <w:p>
-      <w:pPr>
-        <w:pStyle w:val="Commentaire"/>
-      </w:pPr>
-    </w:p>
-    <w:p>
-      <w:pPr>
-        <w:pStyle w:val="Commentaire"/>
-      </w:pPr>
-      <w:r>
-        <w:t>Idéalement, essaye d’</w:t>
-      </w:r>
-      <w:r>
-        <w:t>uniformiser le vocabulaire.</w:t>
+        <w:t>Idéalement, essaye d’uniformiser le vocabulaire.</w:t>
       </w:r>
     </w:p>
     <w:p>
@@ -18521,7 +18776,7 @@
       </w:pPr>
     </w:p>
   </w:comment>
-  <w:comment w:id="199" w:author="Isabelle Gouttevin" w:date="2015-09-18T15:34:00Z" w:initials="IG">
+  <w:comment w:id="198" w:author="Isabelle Gouttevin" w:date="2015-09-18T15:34:00Z" w:initials="IG">
     <w:p>
       <w:pPr>
         <w:pStyle w:val="Commentaire"/>
@@ -18548,7 +18803,7 @@
       </w:r>
     </w:p>
   </w:comment>
-  <w:comment w:id="252" w:author="Isabelle Gouttevin" w:date="2015-09-18T16:03:00Z" w:initials="IG">
+  <w:comment w:id="251" w:author="Isabelle Gouttevin" w:date="2015-09-18T16:03:00Z" w:initials="IG">
     <w:p>
       <w:pPr>
         <w:pStyle w:val="Commentaire"/>
@@ -18751,6 +19006,7 @@
         <w:docPartUnique/>
       </w:docPartObj>
     </w:sdtPr>
+    <w:sdtEndPr/>
     <w:sdtContent>
       <w:p>
         <w:pPr>
@@ -18796,6 +19052,7 @@
         <w:docPartUnique/>
       </w:docPartObj>
     </w:sdtPr>
+    <w:sdtEndPr/>
     <w:sdtContent>
       <w:p>
         <w:pPr>
@@ -18815,7 +19072,7 @@
           <w:rPr>
             <w:noProof/>
           </w:rPr>
-          <w:t>18</w:t>
+          <w:t>9</w:t>
         </w:r>
         <w:r>
           <w:fldChar w:fldCharType="end"/>
@@ -30597,7 +30854,7 @@
 </file>
 
 <file path=customXml/itemProps1.xml><?xml version="1.0" encoding="utf-8"?>
-<ds:datastoreItem xmlns:ds="http://schemas.openxmlformats.org/officeDocument/2006/customXml" ds:itemID="{D1FEA74E-5F0E-4791-9F72-6268E4CFD7EA}">
+<ds:datastoreItem xmlns:ds="http://schemas.openxmlformats.org/officeDocument/2006/customXml" ds:itemID="{18D930F8-5317-467E-80FC-D0045281BD06}">
   <ds:schemaRefs>
     <ds:schemaRef ds:uri="http://schemas.openxmlformats.org/officeDocument/2006/bibliography"/>
   </ds:schemaRefs>

</xml_diff>